<commit_message>
All 1st proofing done
</commit_message>
<xml_diff>
--- a/Received/five/5, hrhg.docx
+++ b/Received/five/5, hrhg.docx
@@ -2,7 +2,6 @@
 <file path=word/document.xml><?xml version="1.0" encoding="utf-8"?>
 <w:document xmlns:wpc="http://schemas.microsoft.com/office/word/2010/wordprocessingCanvas" xmlns:cx="http://schemas.microsoft.com/office/drawing/2014/chartex" xmlns:cx1="http://schemas.microsoft.com/office/drawing/2015/9/8/chartex" xmlns:cx2="http://schemas.microsoft.com/office/drawing/2015/10/21/chartex" xmlns:cx3="http://schemas.microsoft.com/office/drawing/2016/5/9/chartex" xmlns:cx4="http://schemas.microsoft.com/office/drawing/2016/5/10/chartex" xmlns:cx5="http://schemas.microsoft.com/office/drawing/2016/5/11/chartex" xmlns:cx6="http://schemas.microsoft.com/office/drawing/2016/5/12/chartex" xmlns:cx7="http://schemas.microsoft.com/office/drawing/2016/5/13/chartex" xmlns:cx8="http://schemas.microsoft.com/office/drawing/2016/5/14/chartex" xmlns:mc="http://schemas.openxmlformats.org/markup-compatibility/2006" xmlns:aink="http://schemas.microsoft.com/office/drawing/2016/ink" xmlns:am3d="http://schemas.microsoft.com/office/drawing/2017/model3d" xmlns:o="urn:schemas-microsoft-com:office:office" xmlns:oel="http://schemas.microsoft.com/office/2019/extlst" xmlns:r="http://schemas.openxmlformats.org/officeDocument/2006/relationships" xmlns:m="http://schemas.openxmlformats.org/officeDocument/2006/math" xmlns:v="urn:schemas-microsoft-com:vml" xmlns:wp14="http://schemas.microsoft.com/office/word/2010/wordprocessingDrawing" xmlns:wp="http://schemas.openxmlformats.org/drawingml/2006/wordprocessingDrawing" xmlns:w10="urn:schemas-microsoft-com:office:word" xmlns:w="http://schemas.openxmlformats.org/wordprocessingml/2006/main" xmlns:w14="http://schemas.microsoft.com/office/word/2010/wordml" xmlns:w15="http://schemas.microsoft.com/office/word/2012/wordml" xmlns:w16cex="http://schemas.microsoft.com/office/word/2018/wordml/cex" xmlns:w16cid="http://schemas.microsoft.com/office/word/2016/wordml/cid" xmlns:w16="http://schemas.microsoft.com/office/word/2018/wordml" xmlns:w16du="http://schemas.microsoft.com/office/word/2023/wordml/word16du" xmlns:w16sdtdh="http://schemas.microsoft.com/office/word/2020/wordml/sdtdatahash" xmlns:w16sdtfl="http://schemas.microsoft.com/office/word/2024/wordml/sdtformatlock" xmlns:w16se="http://schemas.microsoft.com/office/word/2015/wordml/symex" xmlns:wpg="http://schemas.microsoft.com/office/word/2010/wordprocessingGroup" xmlns:wpi="http://schemas.microsoft.com/office/word/2010/wordprocessingInk" xmlns:wne="http://schemas.microsoft.com/office/word/2006/wordml" xmlns:wps="http://schemas.microsoft.com/office/word/2010/wordprocessingShape" mc:Ignorable="w14 w15 w16se w16cid w16 w16cex w16sdtdh w16sdtfl w16du wp14">
   <w:body>
-    <w:bookmarkStart w:id="0" w:name="_Hlk138315100"/>
     <w:p>
       <w:pPr>
         <w:spacing w:after="0" w:line="240" w:lineRule="auto"/>
@@ -13,24 +12,173 @@
           <w:szCs w:val="36"/>
         </w:rPr>
       </w:pPr>
-      <w:r>
-        <w:rPr>
-          <w:rFonts w:ascii="Times New Roman" w:hAnsi="Times New Roman" w:cs="Times New Roman"/>
+      <w:bookmarkStart w:id="0" w:name="_Hlk138315100"/>
+      <w:r>
+        <w:rPr>
+          <w:rFonts w:ascii="Preeti" w:hAnsi="Preeti"/>
+          <w:b/>
+          <w:bCs/>
           <w:noProof/>
-          <w:szCs w:val="22"/>
+          <w:sz w:val="40"/>
+          <w:szCs w:val="40"/>
         </w:rPr>
         <mc:AlternateContent>
           <mc:Choice Requires="wps">
             <w:drawing>
-              <wp:anchor distT="0" distB="0" distL="114300" distR="114300" simplePos="0" relativeHeight="251659264" behindDoc="0" locked="0" layoutInCell="1" allowOverlap="1" wp14:anchorId="2962D35E" wp14:editId="4F537C03">
+              <wp:anchor distT="45720" distB="45720" distL="114300" distR="114300" simplePos="0" relativeHeight="251661312" behindDoc="0" locked="0" layoutInCell="1" allowOverlap="1" wp14:anchorId="6490F09F" wp14:editId="276BEF5C">
+                <wp:simplePos x="0" y="0"/>
+                <wp:positionH relativeFrom="column">
+                  <wp:posOffset>5831637</wp:posOffset>
+                </wp:positionH>
+                <wp:positionV relativeFrom="paragraph">
+                  <wp:posOffset>-39993</wp:posOffset>
+                </wp:positionV>
+                <wp:extent cx="897147" cy="1404620"/>
+                <wp:effectExtent l="0" t="0" r="0" b="0"/>
+                <wp:wrapNone/>
+                <wp:docPr id="1" name="Text Box 2"/>
+                <wp:cNvGraphicFramePr>
+                  <a:graphicFrameLocks xmlns:a="http://schemas.openxmlformats.org/drawingml/2006/main"/>
+                </wp:cNvGraphicFramePr>
+                <a:graphic xmlns:a="http://schemas.openxmlformats.org/drawingml/2006/main">
+                  <a:graphicData uri="http://schemas.microsoft.com/office/word/2010/wordprocessingShape">
+                    <wps:wsp>
+                      <wps:cNvSpPr txBox="1">
+                        <a:spLocks noChangeArrowheads="1"/>
+                      </wps:cNvSpPr>
+                      <wps:spPr bwMode="auto">
+                        <a:xfrm>
+                          <a:off x="0" y="0"/>
+                          <a:ext cx="897147" cy="1404620"/>
+                        </a:xfrm>
+                        <a:prstGeom prst="rect">
+                          <a:avLst/>
+                        </a:prstGeom>
+                        <a:noFill/>
+                        <a:ln w="9525">
+                          <a:noFill/>
+                          <a:miter lim="800000"/>
+                          <a:headEnd/>
+                          <a:tailEnd/>
+                        </a:ln>
+                      </wps:spPr>
+                      <wps:txbx>
+                        <w:txbxContent>
+                          <w:p>
+                            <w:r>
+                              <w:rPr>
+                                <w:rFonts w:ascii="Times New Roman" w:hAnsi="Times New Roman" w:cs="Times New Roman"/>
+                                <w:b/>
+                                <w:bCs/>
+                                <w:sz w:val="32"/>
+                                <w:szCs w:val="32"/>
+                              </w:rPr>
+                              <w:t>D-</w:t>
+                            </w:r>
+                            <w:r>
+                              <w:rPr>
+                                <w:rFonts w:ascii="Times New Roman" w:hAnsi="Times New Roman" w:cs="Times New Roman"/>
+                                <w:b/>
+                                <w:bCs/>
+                                <w:sz w:val="32"/>
+                                <w:szCs w:val="32"/>
+                              </w:rPr>
+                              <w:t>2</w:t>
+                            </w:r>
+                            <w:r>
+                              <w:rPr>
+                                <w:rFonts w:ascii="Times New Roman" w:hAnsi="Times New Roman" w:cs="Times New Roman"/>
+                                <w:b/>
+                                <w:bCs/>
+                                <w:sz w:val="32"/>
+                                <w:szCs w:val="32"/>
+                              </w:rPr>
+                              <w:t>4</w:t>
+                            </w:r>
+                          </w:p>
+                        </w:txbxContent>
+                      </wps:txbx>
+                      <wps:bodyPr rot="0" vert="horz" wrap="square" lIns="91440" tIns="45720" rIns="91440" bIns="45720" anchor="t" anchorCtr="0">
+                        <a:spAutoFit/>
+                      </wps:bodyPr>
+                    </wps:wsp>
+                  </a:graphicData>
+                </a:graphic>
+                <wp14:sizeRelH relativeFrom="margin">
+                  <wp14:pctWidth>0</wp14:pctWidth>
+                </wp14:sizeRelH>
+                <wp14:sizeRelV relativeFrom="margin">
+                  <wp14:pctHeight>20000</wp14:pctHeight>
+                </wp14:sizeRelV>
+              </wp:anchor>
+            </w:drawing>
+          </mc:Choice>
+          <mc:Fallback>
+            <w:pict>
+              <v:shapetype w14:anchorId="6490F09F" id="_x0000_t202" coordsize="21600,21600" o:spt="202" path="m,l,21600r21600,l21600,xe">
+                <v:stroke joinstyle="miter"/>
+                <v:path gradientshapeok="t" o:connecttype="rect"/>
+              </v:shapetype>
+              <v:shape id="Text Box 2" o:spid="_x0000_s1026" type="#_x0000_t202" style="position:absolute;margin-left:459.2pt;margin-top:-3.15pt;width:70.65pt;height:110.6pt;z-index:251661312;visibility:visible;mso-wrap-style:square;mso-width-percent:0;mso-height-percent:200;mso-wrap-distance-left:9pt;mso-wrap-distance-top:3.6pt;mso-wrap-distance-right:9pt;mso-wrap-distance-bottom:3.6pt;mso-position-horizontal:absolute;mso-position-horizontal-relative:text;mso-position-vertical:absolute;mso-position-vertical-relative:text;mso-width-percent:0;mso-height-percent:200;mso-width-relative:margin;mso-height-relative:margin;v-text-anchor:top" o:gfxdata="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" filled="f" stroked="f">
+                <v:textbox style="mso-fit-shape-to-text:t">
+                  <w:txbxContent>
+                    <w:p>
+                      <w:r>
+                        <w:rPr>
+                          <w:rFonts w:ascii="Times New Roman" w:hAnsi="Times New Roman" w:cs="Times New Roman"/>
+                          <w:b/>
+                          <w:bCs/>
+                          <w:sz w:val="32"/>
+                          <w:szCs w:val="32"/>
+                        </w:rPr>
+                        <w:t>D-</w:t>
+                      </w:r>
+                      <w:r>
+                        <w:rPr>
+                          <w:rFonts w:ascii="Times New Roman" w:hAnsi="Times New Roman" w:cs="Times New Roman"/>
+                          <w:b/>
+                          <w:bCs/>
+                          <w:sz w:val="32"/>
+                          <w:szCs w:val="32"/>
+                        </w:rPr>
+                        <w:t>2</w:t>
+                      </w:r>
+                      <w:r>
+                        <w:rPr>
+                          <w:rFonts w:ascii="Times New Roman" w:hAnsi="Times New Roman" w:cs="Times New Roman"/>
+                          <w:b/>
+                          <w:bCs/>
+                          <w:sz w:val="32"/>
+                          <w:szCs w:val="32"/>
+                        </w:rPr>
+                        <w:t>4</w:t>
+                      </w:r>
+                    </w:p>
+                  </w:txbxContent>
+                </v:textbox>
+              </v:shape>
+            </w:pict>
+          </mc:Fallback>
+        </mc:AlternateContent>
+      </w:r>
+      <w:r>
+        <w:rPr>
+          <w:rFonts w:ascii="Times New Roman" w:hAnsi="Times New Roman" w:cs="Times New Roman"/>
+          <w:noProof/>
+          <w:szCs w:val="22"/>
+        </w:rPr>
+        <mc:AlternateContent>
+          <mc:Choice Requires="wps">
+            <w:drawing>
+              <wp:anchor distT="0" distB="0" distL="114300" distR="114300" simplePos="0" relativeHeight="251659264" behindDoc="0" locked="0" layoutInCell="1" allowOverlap="1" wp14:anchorId="72CA6FF7" wp14:editId="5B3644E0">
                 <wp:simplePos x="0" y="0"/>
                 <wp:positionH relativeFrom="margin">
                   <wp:posOffset>0</wp:posOffset>
                 </wp:positionH>
                 <wp:positionV relativeFrom="paragraph">
-                  <wp:posOffset>7620</wp:posOffset>
+                  <wp:posOffset>8087</wp:posOffset>
                 </wp:positionV>
-                <wp:extent cx="479425" cy="584835"/>
+                <wp:extent cx="479425" cy="584799"/>
                 <wp:effectExtent l="0" t="0" r="0" b="6350"/>
                 <wp:wrapNone/>
                 <wp:docPr id="25" name="Rectangle 1"/>
@@ -61,6 +209,18 @@
                         <a:ln>
                           <a:noFill/>
                         </a:ln>
+                        <a:extLst>
+                          <a:ext uri="{91240B29-F687-4F45-9708-019B960494DF}">
+                            <a14:hiddenLine xmlns:a14="http://schemas.microsoft.com/office/drawing/2010/main" w="25400">
+                              <a:solidFill>
+                                <a:srgbClr val="000000"/>
+                              </a:solidFill>
+                              <a:miter lim="800000"/>
+                              <a:headEnd/>
+                              <a:tailEnd/>
+                            </a14:hiddenLine>
+                          </a:ext>
+                        </a:extLst>
                       </wps:spPr>
                       <wps:bodyPr rot="0" vert="horz" wrap="square" lIns="91440" tIns="45720" rIns="91440" bIns="45720" anchor="ctr" anchorCtr="0" upright="1">
                         <a:noAutofit/>
@@ -68,12 +228,18 @@
                     </wps:wsp>
                   </a:graphicData>
                 </a:graphic>
+                <wp14:sizeRelH relativeFrom="margin">
+                  <wp14:pctWidth>0</wp14:pctWidth>
+                </wp14:sizeRelH>
+                <wp14:sizeRelV relativeFrom="margin">
+                  <wp14:pctHeight>0</wp14:pctHeight>
+                </wp14:sizeRelV>
               </wp:anchor>
             </w:drawing>
           </mc:Choice>
           <mc:Fallback>
             <w:pict>
-              <v:rect w14:anchorId="0213D294" id="Rectangle 1" o:spid="_x0000_s1026" style="position:absolute;margin-left:0;margin-top:.6pt;width:37.75pt;height:46.05pt;z-index:251659264;visibility:visible;mso-wrap-style:square;mso-wrap-distance-left:9pt;mso-wrap-distance-top:0;mso-wrap-distance-right:9pt;mso-wrap-distance-bottom:0;mso-position-horizontal:absolute;mso-position-horizontal-relative:margin;mso-position-vertical:absolute;mso-position-vertical-relative:text;v-text-anchor:middle" o:gfxdata="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" stroked="f">
+              <v:rect w14:anchorId="565BFF6F" id="Rectangle 1" o:spid="_x0000_s1026" style="position:absolute;margin-left:0;margin-top:.65pt;width:37.75pt;height:46.05pt;z-index:251659264;visibility:visible;mso-wrap-style:square;mso-width-percent:0;mso-height-percent:0;mso-wrap-distance-left:9pt;mso-wrap-distance-top:0;mso-wrap-distance-right:9pt;mso-wrap-distance-bottom:0;mso-position-horizontal:absolute;mso-position-horizontal-relative:margin;mso-position-vertical:absolute;mso-position-vertical-relative:text;mso-width-percent:0;mso-height-percent:0;mso-width-relative:margin;mso-height-relative:margin;v-text-anchor:middle" o:gfxdata="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" stroked="f" strokeweight="2pt">
                 <v:fill r:id="rId5" o:title="" recolor="t" rotate="t" type="frame"/>
                 <w10:wrap anchorx="margin"/>
               </v:rect>
@@ -133,15 +299,69 @@
     <w:p>
       <w:pPr>
         <w:spacing w:after="0" w:line="240" w:lineRule="auto"/>
-        <w:ind w:left="450" w:hanging="450"/>
-        <w:jc w:val="center"/>
-        <w:rPr>
-          <w:rFonts w:ascii="Times New Roman" w:hAnsi="Times New Roman" w:cs="Times New Roman"/>
-          <w:b/>
-          <w:sz w:val="28"/>
-          <w:szCs w:val="28"/>
-        </w:rPr>
-      </w:pPr>
+        <w:ind w:hanging="450"/>
+        <w:rPr>
+          <w:rFonts w:ascii="Times New Roman" w:hAnsi="Times New Roman" w:cs="Times New Roman"/>
+          <w:b/>
+          <w:sz w:val="28"/>
+          <w:szCs w:val="28"/>
+        </w:rPr>
+      </w:pPr>
+      <w:r>
+        <w:rPr>
+          <w:rFonts w:ascii="Times New Roman" w:hAnsi="Times New Roman" w:cs="Times New Roman"/>
+          <w:b/>
+          <w:sz w:val="28"/>
+          <w:szCs w:val="28"/>
+        </w:rPr>
+        <w:t xml:space="preserve">       </w:t>
+      </w:r>
+      <w:r>
+        <w:rPr>
+          <w:rFonts w:ascii="Times New Roman" w:hAnsi="Times New Roman" w:cs="Times New Roman"/>
+          <w:b/>
+          <w:sz w:val="28"/>
+          <w:szCs w:val="28"/>
+        </w:rPr>
+        <w:tab/>
+      </w:r>
+      <w:r>
+        <w:rPr>
+          <w:rFonts w:ascii="Times New Roman" w:hAnsi="Times New Roman" w:cs="Times New Roman"/>
+          <w:b/>
+          <w:sz w:val="28"/>
+          <w:szCs w:val="28"/>
+        </w:rPr>
+        <w:tab/>
+      </w:r>
+      <w:r>
+        <w:rPr>
+          <w:rFonts w:ascii="Times New Roman" w:hAnsi="Times New Roman" w:cs="Times New Roman"/>
+          <w:b/>
+          <w:sz w:val="28"/>
+          <w:szCs w:val="28"/>
+        </w:rPr>
+        <w:tab/>
+        <w:t xml:space="preserve"> </w:t>
+      </w:r>
+      <w:r>
+        <w:rPr>
+          <w:rFonts w:ascii="Times New Roman" w:hAnsi="Times New Roman" w:cs="Times New Roman"/>
+          <w:b/>
+          <w:sz w:val="28"/>
+          <w:szCs w:val="28"/>
+        </w:rPr>
+        <w:tab/>
+      </w:r>
+      <w:r>
+        <w:rPr>
+          <w:rFonts w:ascii="Times New Roman" w:hAnsi="Times New Roman" w:cs="Times New Roman"/>
+          <w:b/>
+          <w:sz w:val="28"/>
+          <w:szCs w:val="28"/>
+        </w:rPr>
+        <w:t xml:space="preserve">    </w:t>
+      </w:r>
       <w:r>
         <w:rPr>
           <w:rFonts w:ascii="Times New Roman" w:hAnsi="Times New Roman" w:cs="Times New Roman"/>
@@ -150,7 +370,72 @@
           <w:szCs w:val="28"/>
           <w:u w:val="single"/>
         </w:rPr>
-        <w:t>First Achievement Test-2082</w:t>
+        <w:t>Third Terminal</w:t>
+      </w:r>
+      <w:r>
+        <w:rPr>
+          <w:rFonts w:ascii="Times New Roman" w:hAnsi="Times New Roman" w:cs="Times New Roman"/>
+          <w:b/>
+          <w:sz w:val="28"/>
+          <w:szCs w:val="28"/>
+          <w:u w:val="single"/>
+        </w:rPr>
+        <w:t xml:space="preserve"> Examination-20</w:t>
+      </w:r>
+      <w:r>
+        <w:rPr>
+          <w:rFonts w:ascii="Times New Roman" w:hAnsi="Times New Roman" w:cs="Times New Roman"/>
+          <w:b/>
+          <w:sz w:val="28"/>
+          <w:szCs w:val="28"/>
+          <w:u w:val="single"/>
+        </w:rPr>
+        <w:t>82</w:t>
+      </w:r>
+      <w:r>
+        <w:rPr>
+          <w:rFonts w:ascii="Times New Roman" w:hAnsi="Times New Roman" w:cs="Times New Roman"/>
+          <w:b/>
+          <w:sz w:val="28"/>
+          <w:szCs w:val="28"/>
+        </w:rPr>
+        <w:tab/>
+      </w:r>
+      <w:r>
+        <w:rPr>
+          <w:rFonts w:ascii="Times New Roman" w:hAnsi="Times New Roman" w:cs="Times New Roman"/>
+          <w:b/>
+          <w:sz w:val="28"/>
+          <w:szCs w:val="28"/>
+        </w:rPr>
+        <w:tab/>
+      </w:r>
+      <w:r>
+        <w:rPr>
+          <w:rFonts w:ascii="Times New Roman" w:hAnsi="Times New Roman" w:cs="Times New Roman"/>
+          <w:b/>
+          <w:sz w:val="28"/>
+          <w:szCs w:val="28"/>
+        </w:rPr>
+        <w:tab/>
+      </w:r>
+      <w:r>
+        <w:rPr>
+          <w:rFonts w:ascii="Times New Roman" w:hAnsi="Times New Roman" w:cs="Times New Roman"/>
+          <w:b/>
+          <w:sz w:val="28"/>
+          <w:szCs w:val="28"/>
+        </w:rPr>
+        <w:tab/>
+      </w:r>
+      <w:r>
+        <w:rPr>
+          <w:rFonts w:ascii="Times New Roman" w:hAnsi="Times New Roman" w:cs="Times New Roman"/>
+          <w:b/>
+          <w:sz w:val="28"/>
+          <w:szCs w:val="28"/>
+        </w:rPr>
+        <w:t xml:space="preserve"> </w:t>
       </w:r>
     </w:p>
     <w:p>
@@ -182,26 +467,44 @@
           <w:sz w:val="28"/>
           <w:szCs w:val="28"/>
         </w:rPr>
-        <w:t>5</w:t>
-      </w:r>
-      <w:r>
-        <w:rPr>
-          <w:rFonts w:ascii="Times New Roman" w:hAnsi="Times New Roman" w:cs="Times New Roman"/>
-          <w:b/>
-          <w:sz w:val="28"/>
-          <w:szCs w:val="28"/>
-        </w:rPr>
-        <w:tab/>
-      </w:r>
-      <w:r>
-        <w:rPr>
-          <w:rFonts w:ascii="Times New Roman" w:hAnsi="Times New Roman" w:cs="Times New Roman"/>
-          <w:b/>
-          <w:sz w:val="28"/>
-          <w:szCs w:val="28"/>
-        </w:rPr>
-        <w:tab/>
-        <w:t xml:space="preserve">           </w:t>
+        <w:t xml:space="preserve"> </w:t>
+      </w:r>
+      <w:r>
+        <w:rPr>
+          <w:rFonts w:ascii="Times New Roman" w:hAnsi="Times New Roman" w:cs="Times New Roman"/>
+          <w:b/>
+          <w:sz w:val="28"/>
+          <w:szCs w:val="28"/>
+        </w:rPr>
+        <w:t>Five</w:t>
+      </w:r>
+      <w:r>
+        <w:rPr>
+          <w:rFonts w:ascii="Times New Roman" w:hAnsi="Times New Roman" w:cs="Times New Roman"/>
+          <w:b/>
+          <w:sz w:val="28"/>
+          <w:szCs w:val="28"/>
+        </w:rPr>
+        <w:tab/>
+      </w:r>
+      <w:r>
+        <w:rPr>
+          <w:rFonts w:ascii="Times New Roman" w:hAnsi="Times New Roman" w:cs="Times New Roman"/>
+          <w:b/>
+          <w:sz w:val="28"/>
+          <w:szCs w:val="28"/>
+        </w:rPr>
+        <w:tab/>
+        <w:t xml:space="preserve">       </w:t>
+      </w:r>
+      <w:r>
+        <w:rPr>
+          <w:rFonts w:ascii="Times New Roman" w:hAnsi="Times New Roman" w:cs="Times New Roman"/>
+          <w:b/>
+          <w:sz w:val="28"/>
+          <w:szCs w:val="28"/>
+        </w:rPr>
+        <w:t xml:space="preserve">    </w:t>
       </w:r>
       <w:r>
         <w:rPr>
@@ -228,7 +531,7 @@
           <w:sz w:val="24"/>
           <w:szCs w:val="24"/>
         </w:rPr>
-        <w:t>Time: - 1hrs.</w:t>
+        <w:t>Time: -</w:t>
       </w:r>
       <w:r>
         <w:rPr>
@@ -237,7 +540,7 @@
           <w:sz w:val="24"/>
           <w:szCs w:val="24"/>
         </w:rPr>
-        <w:tab/>
+        <w:t xml:space="preserve"> </w:t>
       </w:r>
       <w:r>
         <w:rPr>
@@ -246,7 +549,7 @@
           <w:sz w:val="24"/>
           <w:szCs w:val="24"/>
         </w:rPr>
-        <w:tab/>
+        <w:t>1</w:t>
       </w:r>
       <w:r>
         <w:rPr>
@@ -255,7 +558,7 @@
           <w:sz w:val="24"/>
           <w:szCs w:val="24"/>
         </w:rPr>
-        <w:tab/>
+        <w:t xml:space="preserve"> </w:t>
       </w:r>
       <w:r>
         <w:rPr>
@@ -264,16 +567,79 @@
           <w:sz w:val="24"/>
           <w:szCs w:val="24"/>
         </w:rPr>
-        <w:tab/>
-      </w:r>
-      <w:r>
-        <w:rPr>
-          <w:rFonts w:ascii="Times New Roman" w:hAnsi="Times New Roman" w:cs="Times New Roman"/>
-          <w:b/>
-          <w:sz w:val="28"/>
-          <w:szCs w:val="28"/>
-        </w:rPr>
-        <w:t xml:space="preserve">F.M.:25  </w:t>
+        <w:t>hr.</w:t>
+      </w:r>
+      <w:r>
+        <w:rPr>
+          <w:rFonts w:ascii="Times New Roman" w:hAnsi="Times New Roman" w:cs="Times New Roman"/>
+          <w:b/>
+          <w:sz w:val="24"/>
+          <w:szCs w:val="24"/>
+        </w:rPr>
+        <w:tab/>
+      </w:r>
+      <w:r>
+        <w:rPr>
+          <w:rFonts w:ascii="Times New Roman" w:hAnsi="Times New Roman" w:cs="Times New Roman"/>
+          <w:b/>
+          <w:sz w:val="24"/>
+          <w:szCs w:val="24"/>
+        </w:rPr>
+        <w:tab/>
+      </w:r>
+      <w:r>
+        <w:rPr>
+          <w:rFonts w:ascii="Times New Roman" w:hAnsi="Times New Roman" w:cs="Times New Roman"/>
+          <w:b/>
+          <w:sz w:val="24"/>
+          <w:szCs w:val="24"/>
+        </w:rPr>
+        <w:tab/>
+      </w:r>
+      <w:r>
+        <w:rPr>
+          <w:rFonts w:ascii="Times New Roman" w:hAnsi="Times New Roman" w:cs="Times New Roman"/>
+          <w:b/>
+          <w:sz w:val="24"/>
+          <w:szCs w:val="24"/>
+        </w:rPr>
+        <w:tab/>
+      </w:r>
+      <w:r>
+        <w:rPr>
+          <w:rFonts w:ascii="Times New Roman" w:hAnsi="Times New Roman" w:cs="Times New Roman"/>
+          <w:b/>
+          <w:sz w:val="24"/>
+          <w:szCs w:val="24"/>
+        </w:rPr>
+        <w:tab/>
+      </w:r>
+      <w:r>
+        <w:rPr>
+          <w:rFonts w:ascii="Times New Roman" w:hAnsi="Times New Roman" w:cs="Times New Roman"/>
+          <w:b/>
+          <w:sz w:val="24"/>
+          <w:szCs w:val="24"/>
+        </w:rPr>
+        <w:tab/>
+      </w:r>
+      <w:r>
+        <w:rPr>
+          <w:rFonts w:ascii="Times New Roman" w:hAnsi="Times New Roman" w:cs="Times New Roman"/>
+          <w:b/>
+          <w:sz w:val="28"/>
+          <w:szCs w:val="28"/>
+        </w:rPr>
+        <w:t>F.M.:</w:t>
+      </w:r>
+      <w:r>
+        <w:rPr>
+          <w:rFonts w:ascii="Times New Roman" w:hAnsi="Times New Roman" w:cs="Times New Roman"/>
+          <w:b/>
+          <w:sz w:val="28"/>
+          <w:szCs w:val="28"/>
+        </w:rPr>
+        <w:t xml:space="preserve"> 25</w:t>
       </w:r>
     </w:p>
     <w:p>
@@ -296,100 +662,27 @@
           <w:sz w:val="28"/>
           <w:szCs w:val="28"/>
         </w:rPr>
-        <w:t>Sub: HRHG</w:t>
-      </w:r>
-      <w:r>
-        <w:rPr>
-          <w:rFonts w:ascii="Times New Roman" w:hAnsi="Times New Roman" w:cs="Times New Roman"/>
-          <w:b/>
-          <w:sz w:val="28"/>
-          <w:szCs w:val="28"/>
-        </w:rPr>
-        <w:tab/>
-      </w:r>
-      <w:r>
-        <w:rPr>
-          <w:rFonts w:ascii="Times New Roman" w:hAnsi="Times New Roman" w:cs="Times New Roman"/>
-          <w:b/>
-          <w:sz w:val="28"/>
-          <w:szCs w:val="28"/>
-        </w:rPr>
-        <w:tab/>
-      </w:r>
-      <w:r>
-        <w:rPr>
-          <w:rFonts w:ascii="Times New Roman" w:hAnsi="Times New Roman" w:cs="Times New Roman"/>
-          <w:b/>
-          <w:sz w:val="28"/>
-          <w:szCs w:val="28"/>
-        </w:rPr>
-        <w:tab/>
-      </w:r>
-      <w:r>
-        <w:rPr>
-          <w:rFonts w:ascii="Times New Roman" w:hAnsi="Times New Roman" w:cs="Times New Roman"/>
-          <w:b/>
-          <w:sz w:val="28"/>
-          <w:szCs w:val="28"/>
-        </w:rPr>
-        <w:tab/>
-      </w:r>
-      <w:r>
-        <w:rPr>
-          <w:rFonts w:ascii="Times New Roman" w:hAnsi="Times New Roman" w:cs="Times New Roman"/>
-          <w:b/>
-          <w:sz w:val="28"/>
-          <w:szCs w:val="28"/>
-        </w:rPr>
-        <w:tab/>
-      </w:r>
-      <w:r>
-        <w:rPr>
-          <w:rFonts w:ascii="Times New Roman" w:hAnsi="Times New Roman" w:cs="Times New Roman"/>
-          <w:b/>
-          <w:sz w:val="28"/>
-          <w:szCs w:val="28"/>
-        </w:rPr>
-        <w:tab/>
-      </w:r>
-      <w:r>
-        <w:rPr>
-          <w:rFonts w:ascii="Times New Roman" w:hAnsi="Times New Roman" w:cs="Times New Roman"/>
-          <w:b/>
-          <w:sz w:val="28"/>
-          <w:szCs w:val="28"/>
-        </w:rPr>
-        <w:tab/>
-      </w:r>
-      <w:r>
-        <w:rPr>
-          <w:rFonts w:ascii="Times New Roman" w:hAnsi="Times New Roman" w:cs="Times New Roman"/>
-          <w:b/>
-          <w:sz w:val="28"/>
-          <w:szCs w:val="28"/>
-        </w:rPr>
-        <w:tab/>
-      </w:r>
-      <w:r>
-        <w:rPr>
-          <w:rFonts w:ascii="Times New Roman" w:hAnsi="Times New Roman" w:cs="Times New Roman"/>
-          <w:b/>
-          <w:sz w:val="28"/>
-          <w:szCs w:val="28"/>
-        </w:rPr>
-        <w:tab/>
-        <w:t xml:space="preserve">P.M.:09 </w:t>
+        <w:t>Sub:</w:t>
+      </w:r>
+      <w:r>
+        <w:rPr>
+          <w:rFonts w:ascii="Times New Roman" w:hAnsi="Times New Roman" w:cs="Times New Roman"/>
+          <w:b/>
+          <w:sz w:val="28"/>
+          <w:szCs w:val="28"/>
+        </w:rPr>
+        <w:t xml:space="preserve"> HRHG</w:t>
       </w:r>
     </w:p>
     <w:tbl>
       <w:tblPr>
         <w:tblStyle w:val="TableGrid"/>
-        <w:tblW w:w="10348" w:type="dxa"/>
-        <w:tblInd w:w="-147" w:type="dxa"/>
+        <w:tblW w:w="10492" w:type="dxa"/>
+        <w:tblInd w:w="108" w:type="dxa"/>
         <w:tblLook w:val="04A0" w:firstRow="1" w:lastRow="0" w:firstColumn="1" w:lastColumn="0" w:noHBand="0" w:noVBand="1"/>
       </w:tblPr>
       <w:tblGrid>
-        <w:gridCol w:w="10348"/>
+        <w:gridCol w:w="10492"/>
       </w:tblGrid>
       <w:tr>
         <w:trPr>
@@ -397,11 +690,11 @@
         </w:trPr>
         <w:tc>
           <w:tcPr>
-            <w:tcW w:w="10348" w:type="dxa"/>
+            <w:tcW w:w="10492" w:type="dxa"/>
           </w:tcPr>
           <w:p>
             <w:pPr>
-              <w:spacing w:before="120"/>
+              <w:spacing w:before="120" w:after="0" w:line="240" w:lineRule="auto"/>
               <w:ind w:right="-653"/>
               <w:rPr>
                 <w:rFonts w:ascii="Times New Roman" w:hAnsi="Times New Roman" w:cs="Times New Roman"/>
@@ -417,21 +710,59 @@
                 <w:sz w:val="28"/>
                 <w:szCs w:val="28"/>
               </w:rPr>
-              <w:t xml:space="preserve">Name:                                                                            Roll No.:           Sec.:                                    </w:t>
+              <w:t>N</w:t>
+            </w:r>
+            <w:r>
+              <w:rPr>
+                <w:rFonts w:ascii="Times New Roman" w:hAnsi="Times New Roman" w:cs="Times New Roman"/>
+                <w:b/>
+                <w:sz w:val="28"/>
+                <w:szCs w:val="28"/>
+              </w:rPr>
+              <w:t>ame</w:t>
+            </w:r>
+            <w:r>
+              <w:rPr>
+                <w:rFonts w:ascii="Times New Roman" w:hAnsi="Times New Roman" w:cs="Times New Roman"/>
+                <w:b/>
+                <w:sz w:val="28"/>
+                <w:szCs w:val="28"/>
+              </w:rPr>
+              <w:t xml:space="preserve">:                                                        </w:t>
+            </w:r>
+            <w:r>
+              <w:rPr>
+                <w:rFonts w:ascii="Times New Roman" w:hAnsi="Times New Roman" w:cs="Times New Roman"/>
+                <w:b/>
+                <w:sz w:val="28"/>
+                <w:szCs w:val="28"/>
+              </w:rPr>
+              <w:t xml:space="preserve">                  </w:t>
+            </w:r>
+            <w:r>
+              <w:rPr>
+                <w:rFonts w:ascii="Times New Roman" w:hAnsi="Times New Roman" w:cs="Times New Roman"/>
+                <w:b/>
+                <w:sz w:val="28"/>
+                <w:szCs w:val="28"/>
+              </w:rPr>
+              <w:t xml:space="preserve">  Roll No.:           Sec.:                                    </w:t>
             </w:r>
           </w:p>
         </w:tc>
       </w:tr>
       <w:tr>
         <w:trPr>
-          <w:trHeight w:val="386"/>
+          <w:trHeight w:val="1070"/>
         </w:trPr>
         <w:tc>
           <w:tcPr>
-            <w:tcW w:w="10348" w:type="dxa"/>
+            <w:tcW w:w="10492" w:type="dxa"/>
           </w:tcPr>
           <w:p>
             <w:pPr>
+              <w:spacing w:after="0" w:line="240" w:lineRule="auto"/>
+              <w:ind w:left="180" w:firstLine="360"/>
               <w:rPr>
                 <w:rFonts w:ascii="Times New Roman" w:hAnsi="Times New Roman" w:cs="Times New Roman"/>
                 <w:b/>
@@ -448,27 +779,31 @@
               <mc:AlternateContent>
                 <mc:Choice Requires="wps">
                   <w:drawing>
-                    <wp:anchor distT="0" distB="0" distL="114300" distR="114300" simplePos="0" relativeHeight="251660288" behindDoc="0" locked="0" layoutInCell="1" allowOverlap="1" wp14:anchorId="50C96823" wp14:editId="59ACF9E1">
+                    <wp:anchor distT="0" distB="0" distL="114300" distR="114300" simplePos="0" relativeHeight="251660288" behindDoc="0" locked="0" layoutInCell="1" allowOverlap="1" wp14:anchorId="4BFD1FD0" wp14:editId="48BA519E">
                       <wp:simplePos x="0" y="0"/>
                       <wp:positionH relativeFrom="column">
-                        <wp:posOffset>5770880</wp:posOffset>
+                        <wp:posOffset>5427345</wp:posOffset>
                       </wp:positionH>
                       <wp:positionV relativeFrom="paragraph">
-                        <wp:posOffset>53975</wp:posOffset>
+                        <wp:posOffset>103505</wp:posOffset>
                       </wp:positionV>
-                      <wp:extent cx="748665" cy="227330"/>
-                      <wp:effectExtent l="19050" t="19050" r="13335" b="20320"/>
+                      <wp:extent cx="1095375" cy="436245"/>
+                      <wp:effectExtent l="19050" t="19050" r="28575" b="20955"/>
                       <wp:wrapNone/>
                       <wp:docPr id="8" name="Rectangle 2"/>
-                      <wp:cNvGraphicFramePr/>
+                      <wp:cNvGraphicFramePr>
+                        <a:graphicFrameLocks xmlns:a="http://schemas.openxmlformats.org/drawingml/2006/main"/>
+                      </wp:cNvGraphicFramePr>
                       <a:graphic xmlns:a="http://schemas.openxmlformats.org/drawingml/2006/main">
                         <a:graphicData uri="http://schemas.microsoft.com/office/word/2010/wordprocessingShape">
                           <wps:wsp>
-                            <wps:cNvSpPr/>
+                            <wps:cNvSpPr>
+                              <a:spLocks/>
+                            </wps:cNvSpPr>
                             <wps:spPr>
                               <a:xfrm>
                                 <a:off x="0" y="0"/>
-                                <a:ext cx="748665" cy="227441"/>
+                                <a:ext cx="1095375" cy="436245"/>
                               </a:xfrm>
                               <a:prstGeom prst="rect">
                                 <a:avLst/>
@@ -494,17 +829,28 @@
                               </a:fontRef>
                             </wps:style>
                             <wps:bodyPr rot="0" spcFirstLastPara="0" vertOverflow="overflow" horzOverflow="overflow" vert="horz" wrap="square" lIns="91440" tIns="45720" rIns="91440" bIns="45720" numCol="1" spcCol="0" rtlCol="0" fromWordArt="0" anchor="ctr" anchorCtr="0" forceAA="0" compatLnSpc="1">
+                              <a:prstTxWarp prst="textNoShape">
+                                <a:avLst/>
+                              </a:prstTxWarp>
                               <a:noAutofit/>
                             </wps:bodyPr>
                           </wps:wsp>
                         </a:graphicData>
                       </a:graphic>
+                      <wp14:sizeRelH relativeFrom="page">
+                        <wp14:pctWidth>0</wp14:pctWidth>
+                      </wp14:sizeRelH>
+                      <wp14:sizeRelV relativeFrom="margin">
+                        <wp14:pctHeight>0</wp14:pctHeight>
+                      </wp14:sizeRelV>
                     </wp:anchor>
                   </w:drawing>
                 </mc:Choice>
                 <mc:Fallback>
                   <w:pict>
-                    <v:rect w14:anchorId="01A54995" id="Rectangle 2" o:spid="_x0000_s1026" style="position:absolute;margin-left:454.4pt;margin-top:4.25pt;width:58.95pt;height:17.9pt;z-index:251660288;visibility:visible;mso-wrap-style:square;mso-wrap-distance-left:9pt;mso-wrap-distance-top:0;mso-wrap-distance-right:9pt;mso-wrap-distance-bottom:0;mso-position-horizontal:absolute;mso-position-horizontal-relative:text;mso-position-vertical:absolute;mso-position-vertical-relative:text;v-text-anchor:middle" o:gfxdata="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" fillcolor="white [3201]" strokecolor="black [3213]" strokeweight="2.25pt"/>
+                    <v:rect w14:anchorId="63C7EEB8" id="Rectangle 2" o:spid="_x0000_s1026" style="position:absolute;margin-left:427.35pt;margin-top:8.15pt;width:86.25pt;height:34.35pt;z-index:251660288;visibility:visible;mso-wrap-style:square;mso-width-percent:0;mso-height-percent:0;mso-wrap-distance-left:9pt;mso-wrap-distance-top:0;mso-wrap-distance-right:9pt;mso-wrap-distance-bottom:0;mso-position-horizontal:absolute;mso-position-horizontal-relative:text;mso-position-vertical:absolute;mso-position-vertical-relative:text;mso-width-percent:0;mso-height-percent:0;mso-width-relative:page;mso-height-relative:margin;v-text-anchor:middle" o:gfxdata="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" fillcolor="white [3201]" strokecolor="black [3213]" strokeweight="2.25pt">
+                      <v:path arrowok="t"/>
+                    </v:rect>
                   </w:pict>
                 </mc:Fallback>
               </mc:AlternateContent>
@@ -516,7 +862,28 @@
                 <w:sz w:val="28"/>
                 <w:szCs w:val="28"/>
               </w:rPr>
-              <w:tab/>
+              <w:t xml:space="preserve"> </w:t>
+            </w:r>
+          </w:p>
+          <w:p>
+            <w:pPr>
+              <w:spacing w:after="0" w:line="240" w:lineRule="auto"/>
+              <w:ind w:left="180" w:firstLine="360"/>
+              <w:rPr>
+                <w:rFonts w:ascii="Times New Roman" w:hAnsi="Times New Roman" w:cs="Times New Roman"/>
+                <w:b/>
+                <w:sz w:val="28"/>
+                <w:szCs w:val="28"/>
+              </w:rPr>
+            </w:pPr>
+            <w:r>
+              <w:rPr>
+                <w:rFonts w:ascii="Times New Roman" w:hAnsi="Times New Roman" w:cs="Times New Roman"/>
+                <w:b/>
+                <w:sz w:val="28"/>
+                <w:szCs w:val="28"/>
+              </w:rPr>
+              <w:softHyphen/>
             </w:r>
             <w:r>
               <w:rPr>
@@ -525,7 +892,7 @@
                 <w:sz w:val="28"/>
                 <w:szCs w:val="28"/>
               </w:rPr>
-              <w:tab/>
+              <w:softHyphen/>
             </w:r>
             <w:r>
               <w:rPr>
@@ -534,7 +901,7 @@
                 <w:sz w:val="28"/>
                 <w:szCs w:val="28"/>
               </w:rPr>
-              <w:tab/>
+              <w:softHyphen/>
             </w:r>
             <w:r>
               <w:rPr>
@@ -543,7 +910,7 @@
                 <w:sz w:val="28"/>
                 <w:szCs w:val="28"/>
               </w:rPr>
-              <w:tab/>
+              <w:softHyphen/>
             </w:r>
             <w:r>
               <w:rPr>
@@ -552,7 +919,7 @@
                 <w:sz w:val="28"/>
                 <w:szCs w:val="28"/>
               </w:rPr>
-              <w:tab/>
+              <w:softHyphen/>
             </w:r>
             <w:r>
               <w:rPr>
@@ -561,7 +928,7 @@
                 <w:sz w:val="28"/>
                 <w:szCs w:val="28"/>
               </w:rPr>
-              <w:tab/>
+              <w:softHyphen/>
             </w:r>
             <w:r>
               <w:rPr>
@@ -570,7 +937,7 @@
                 <w:sz w:val="28"/>
                 <w:szCs w:val="28"/>
               </w:rPr>
-              <w:tab/>
+              <w:softHyphen/>
             </w:r>
             <w:r>
               <w:rPr>
@@ -579,7 +946,7 @@
                 <w:sz w:val="28"/>
                 <w:szCs w:val="28"/>
               </w:rPr>
-              <w:tab/>
+              <w:softHyphen/>
             </w:r>
             <w:r>
               <w:rPr>
@@ -588,7 +955,7 @@
                 <w:sz w:val="28"/>
                 <w:szCs w:val="28"/>
               </w:rPr>
-              <w:tab/>
+              <w:softHyphen/>
             </w:r>
             <w:r>
               <w:rPr>
@@ -597,8 +964,92 @@
                 <w:sz w:val="28"/>
                 <w:szCs w:val="28"/>
               </w:rPr>
-              <w:tab/>
+              <w:softHyphen/>
+            </w:r>
+            <w:r>
+              <w:rPr>
+                <w:rFonts w:ascii="Times New Roman" w:hAnsi="Times New Roman" w:cs="Times New Roman"/>
+                <w:b/>
+                <w:sz w:val="28"/>
+                <w:szCs w:val="28"/>
+              </w:rPr>
+              <w:softHyphen/>
+            </w:r>
+            <w:r>
+              <w:rPr>
+                <w:rFonts w:ascii="Times New Roman" w:hAnsi="Times New Roman" w:cs="Times New Roman"/>
+                <w:b/>
+                <w:sz w:val="28"/>
+                <w:szCs w:val="28"/>
+              </w:rPr>
+              <w:softHyphen/>
+              <w:t xml:space="preserve"> ________________                </w:t>
+            </w:r>
+            <w:r>
+              <w:rPr>
+                <w:rFonts w:ascii="Times New Roman" w:hAnsi="Times New Roman" w:cs="Times New Roman"/>
+                <w:b/>
+                <w:sz w:val="28"/>
+                <w:szCs w:val="28"/>
+              </w:rPr>
+              <w:t xml:space="preserve">      ______________    </w:t>
+            </w:r>
+            <w:r>
+              <w:rPr>
+                <w:rFonts w:ascii="Times New Roman" w:hAnsi="Times New Roman" w:cs="Times New Roman"/>
+                <w:b/>
+                <w:sz w:val="28"/>
+                <w:szCs w:val="28"/>
+              </w:rPr>
               <w:t>OBT.MARKS:</w:t>
+            </w:r>
+          </w:p>
+          <w:p>
+            <w:pPr>
+              <w:spacing w:after="0" w:line="240" w:lineRule="auto"/>
+              <w:ind w:left="180" w:firstLine="360"/>
+              <w:rPr>
+                <w:rFonts w:ascii="Times New Roman" w:hAnsi="Times New Roman" w:cs="Times New Roman"/>
+                <w:b/>
+                <w:sz w:val="28"/>
+                <w:szCs w:val="28"/>
+              </w:rPr>
+            </w:pPr>
+            <w:r>
+              <w:rPr>
+                <w:rFonts w:ascii="Times New Roman" w:hAnsi="Times New Roman" w:cs="Times New Roman"/>
+                <w:b/>
+                <w:sz w:val="28"/>
+                <w:szCs w:val="28"/>
+              </w:rPr>
+              <w:t xml:space="preserve">    </w:t>
+            </w:r>
+            <w:r>
+              <w:rPr>
+                <w:rFonts w:ascii="Times New Roman" w:hAnsi="Times New Roman" w:cs="Times New Roman"/>
+                <w:b/>
+                <w:sz w:val="28"/>
+                <w:szCs w:val="28"/>
+              </w:rPr>
+              <w:t xml:space="preserve">INVIGILATOR </w:t>
+            </w:r>
+            <w:r>
+              <w:rPr>
+                <w:rFonts w:ascii="Times New Roman" w:hAnsi="Times New Roman" w:cs="Times New Roman"/>
+                <w:b/>
+                <w:sz w:val="28"/>
+                <w:szCs w:val="28"/>
+              </w:rPr>
+              <w:t xml:space="preserve">                         </w:t>
+            </w:r>
+            <w:r>
+              <w:rPr>
+                <w:rFonts w:ascii="Times New Roman" w:hAnsi="Times New Roman" w:cs="Times New Roman"/>
+                <w:b/>
+                <w:sz w:val="28"/>
+                <w:szCs w:val="28"/>
+              </w:rPr>
+              <w:t xml:space="preserve"> EXAMINER</w:t>
             </w:r>
           </w:p>
         </w:tc>
@@ -607,34 +1058,139 @@
     <w:bookmarkEnd w:id="0"/>
     <w:p>
       <w:pPr>
-        <w:rPr>
-          <w:rFonts w:ascii="Times New Roman" w:hAnsi="Times New Roman" w:cs="Times New Roman"/>
-          <w:b/>
-          <w:bCs/>
-          <w:szCs w:val="22"/>
-        </w:rPr>
-      </w:pPr>
-      <w:r>
-        <w:rPr>
-          <w:rFonts w:ascii="Times New Roman" w:hAnsi="Times New Roman" w:cs="Times New Roman"/>
-          <w:b/>
-          <w:bCs/>
-          <w:szCs w:val="22"/>
-        </w:rPr>
-        <w:t xml:space="preserve">1. Write very short answer. (5×1=5) </w:t>
-      </w:r>
-    </w:p>
-    <w:p>
-      <w:pPr>
-        <w:rPr>
-          <w:rFonts w:ascii="Times New Roman" w:hAnsi="Times New Roman" w:cs="Times New Roman"/>
-          <w:szCs w:val="22"/>
-        </w:rPr>
-      </w:pPr>
-      <w:r>
-        <w:rPr>
-          <w:rFonts w:ascii="Times New Roman" w:hAnsi="Times New Roman" w:cs="Times New Roman"/>
-          <w:szCs w:val="22"/>
+        <w:spacing w:after="0" w:line="240" w:lineRule="auto"/>
+        <w:rPr>
+          <w:rFonts w:ascii="Times New Roman" w:hAnsi="Times New Roman" w:cs="Times New Roman"/>
+          <w:b/>
+          <w:bCs/>
+          <w:sz w:val="28"/>
+          <w:szCs w:val="28"/>
+        </w:rPr>
+      </w:pPr>
+      <w:r>
+        <w:rPr>
+          <w:rFonts w:ascii="Times New Roman" w:hAnsi="Times New Roman" w:cs="Times New Roman"/>
+          <w:b/>
+          <w:bCs/>
+          <w:sz w:val="28"/>
+          <w:szCs w:val="28"/>
+        </w:rPr>
+        <w:t>1. Write very short answer.</w:t>
+      </w:r>
+      <w:r>
+        <w:rPr>
+          <w:rFonts w:ascii="Times New Roman" w:hAnsi="Times New Roman" w:cs="Times New Roman"/>
+          <w:b/>
+          <w:bCs/>
+          <w:sz w:val="28"/>
+          <w:szCs w:val="28"/>
+        </w:rPr>
+        <w:tab/>
+      </w:r>
+      <w:r>
+        <w:rPr>
+          <w:rFonts w:ascii="Times New Roman" w:hAnsi="Times New Roman" w:cs="Times New Roman"/>
+          <w:b/>
+          <w:bCs/>
+          <w:sz w:val="28"/>
+          <w:szCs w:val="28"/>
+        </w:rPr>
+        <w:tab/>
+      </w:r>
+      <w:r>
+        <w:rPr>
+          <w:rFonts w:ascii="Times New Roman" w:hAnsi="Times New Roman" w:cs="Times New Roman"/>
+          <w:b/>
+          <w:bCs/>
+          <w:sz w:val="28"/>
+          <w:szCs w:val="28"/>
+        </w:rPr>
+        <w:tab/>
+      </w:r>
+      <w:r>
+        <w:rPr>
+          <w:rFonts w:ascii="Times New Roman" w:hAnsi="Times New Roman" w:cs="Times New Roman"/>
+          <w:b/>
+          <w:bCs/>
+          <w:sz w:val="28"/>
+          <w:szCs w:val="28"/>
+        </w:rPr>
+        <w:tab/>
+      </w:r>
+      <w:r>
+        <w:rPr>
+          <w:rFonts w:ascii="Times New Roman" w:hAnsi="Times New Roman" w:cs="Times New Roman"/>
+          <w:b/>
+          <w:bCs/>
+          <w:sz w:val="28"/>
+          <w:szCs w:val="28"/>
+        </w:rPr>
+        <w:tab/>
+      </w:r>
+      <w:r>
+        <w:rPr>
+          <w:rFonts w:ascii="Times New Roman" w:hAnsi="Times New Roman" w:cs="Times New Roman"/>
+          <w:b/>
+          <w:bCs/>
+          <w:sz w:val="28"/>
+          <w:szCs w:val="28"/>
+        </w:rPr>
+        <w:tab/>
+      </w:r>
+      <w:r>
+        <w:rPr>
+          <w:rFonts w:ascii="Times New Roman" w:hAnsi="Times New Roman" w:cs="Times New Roman"/>
+          <w:b/>
+          <w:bCs/>
+          <w:sz w:val="28"/>
+          <w:szCs w:val="28"/>
+        </w:rPr>
+        <w:tab/>
+      </w:r>
+      <w:r>
+        <w:rPr>
+          <w:rFonts w:ascii="Times New Roman" w:hAnsi="Times New Roman" w:cs="Times New Roman"/>
+          <w:b/>
+          <w:bCs/>
+          <w:sz w:val="28"/>
+          <w:szCs w:val="28"/>
+        </w:rPr>
+        <w:tab/>
+      </w:r>
+      <w:r>
+        <w:rPr>
+          <w:rFonts w:ascii="Times New Roman" w:hAnsi="Times New Roman" w:cs="Times New Roman"/>
+          <w:b/>
+          <w:bCs/>
+          <w:sz w:val="28"/>
+          <w:szCs w:val="28"/>
+        </w:rPr>
+        <w:tab/>
+      </w:r>
+      <w:r>
+        <w:rPr>
+          <w:rFonts w:ascii="Times New Roman" w:hAnsi="Times New Roman" w:cs="Times New Roman"/>
+          <w:b/>
+          <w:bCs/>
+          <w:sz w:val="28"/>
+          <w:szCs w:val="28"/>
+        </w:rPr>
+        <w:t xml:space="preserve">(5×1=5) </w:t>
+      </w:r>
+    </w:p>
+    <w:p>
+      <w:pPr>
+        <w:rPr>
+          <w:rFonts w:ascii="Times New Roman" w:hAnsi="Times New Roman" w:cs="Times New Roman"/>
+          <w:sz w:val="28"/>
+          <w:szCs w:val="28"/>
+        </w:rPr>
+      </w:pPr>
+      <w:r>
+        <w:rPr>
+          <w:rFonts w:ascii="Times New Roman" w:hAnsi="Times New Roman" w:cs="Times New Roman"/>
+          <w:sz w:val="28"/>
+          <w:szCs w:val="28"/>
         </w:rPr>
         <w:t xml:space="preserve">a. Who fulfils your basic needs? </w:t>
       </w:r>
@@ -643,35 +1199,32 @@
       <w:pPr>
         <w:rPr>
           <w:rFonts w:ascii="Times New Roman" w:hAnsi="Times New Roman" w:cs="Times New Roman"/>
-          <w:szCs w:val="22"/>
-        </w:rPr>
-      </w:pPr>
-      <w:r>
-        <w:rPr>
-          <w:rFonts w:ascii="Times New Roman" w:hAnsi="Times New Roman" w:cs="Times New Roman"/>
-          <w:szCs w:val="22"/>
-        </w:rPr>
-        <w:t>………………………………………………………………………………………………………</w:t>
-      </w:r>
-      <w:r>
-        <w:rPr>
-          <w:rFonts w:ascii="Times New Roman" w:hAnsi="Times New Roman" w:cs="Times New Roman"/>
-          <w:szCs w:val="22"/>
-        </w:rPr>
-        <w:t>………..</w:t>
-      </w:r>
-    </w:p>
-    <w:p>
-      <w:pPr>
-        <w:rPr>
-          <w:rFonts w:ascii="Times New Roman" w:hAnsi="Times New Roman" w:cs="Times New Roman"/>
-          <w:szCs w:val="22"/>
-        </w:rPr>
-      </w:pPr>
-      <w:r>
-        <w:rPr>
-          <w:rFonts w:ascii="Times New Roman" w:hAnsi="Times New Roman" w:cs="Times New Roman"/>
-          <w:szCs w:val="22"/>
+          <w:sz w:val="28"/>
+          <w:szCs w:val="28"/>
+        </w:rPr>
+      </w:pPr>
+      <w:r>
+        <w:rPr>
+          <w:rFonts w:ascii="Times New Roman" w:hAnsi="Times New Roman" w:cs="Times New Roman"/>
+          <w:sz w:val="28"/>
+          <w:szCs w:val="28"/>
+        </w:rPr>
+        <w:t>…………………………………………………………………………………………………</w:t>
+      </w:r>
+    </w:p>
+    <w:p>
+      <w:pPr>
+        <w:rPr>
+          <w:rFonts w:ascii="Times New Roman" w:hAnsi="Times New Roman" w:cs="Times New Roman"/>
+          <w:sz w:val="28"/>
+          <w:szCs w:val="28"/>
+        </w:rPr>
+      </w:pPr>
+      <w:r>
+        <w:rPr>
+          <w:rFonts w:ascii="Times New Roman" w:hAnsi="Times New Roman" w:cs="Times New Roman"/>
+          <w:sz w:val="28"/>
+          <w:szCs w:val="28"/>
         </w:rPr>
         <w:t xml:space="preserve">b. Write one cause of conflict between human and wildlife. </w:t>
       </w:r>
@@ -680,35 +1233,32 @@
       <w:pPr>
         <w:rPr>
           <w:rFonts w:ascii="Times New Roman" w:hAnsi="Times New Roman" w:cs="Times New Roman"/>
-          <w:szCs w:val="22"/>
-        </w:rPr>
-      </w:pPr>
-      <w:r>
-        <w:rPr>
-          <w:rFonts w:ascii="Times New Roman" w:hAnsi="Times New Roman" w:cs="Times New Roman"/>
-          <w:szCs w:val="22"/>
-        </w:rPr>
-        <w:t>………………………………………………………………………………………………………</w:t>
-      </w:r>
-      <w:r>
-        <w:rPr>
-          <w:rFonts w:ascii="Times New Roman" w:hAnsi="Times New Roman" w:cs="Times New Roman"/>
-          <w:szCs w:val="22"/>
-        </w:rPr>
-        <w:t>………..</w:t>
-      </w:r>
-    </w:p>
-    <w:p>
-      <w:pPr>
-        <w:rPr>
-          <w:rFonts w:ascii="Times New Roman" w:hAnsi="Times New Roman" w:cs="Times New Roman"/>
-          <w:szCs w:val="22"/>
-        </w:rPr>
-      </w:pPr>
-      <w:r>
-        <w:rPr>
-          <w:rFonts w:ascii="Times New Roman" w:hAnsi="Times New Roman" w:cs="Times New Roman"/>
-          <w:szCs w:val="22"/>
+          <w:sz w:val="28"/>
+          <w:szCs w:val="28"/>
+        </w:rPr>
+      </w:pPr>
+      <w:r>
+        <w:rPr>
+          <w:rFonts w:ascii="Times New Roman" w:hAnsi="Times New Roman" w:cs="Times New Roman"/>
+          <w:sz w:val="28"/>
+          <w:szCs w:val="28"/>
+        </w:rPr>
+        <w:t>…………………………………………………………………………………………………</w:t>
+      </w:r>
+    </w:p>
+    <w:p>
+      <w:pPr>
+        <w:rPr>
+          <w:rFonts w:ascii="Times New Roman" w:hAnsi="Times New Roman" w:cs="Times New Roman"/>
+          <w:sz w:val="28"/>
+          <w:szCs w:val="28"/>
+        </w:rPr>
+      </w:pPr>
+      <w:r>
+        <w:rPr>
+          <w:rFonts w:ascii="Times New Roman" w:hAnsi="Times New Roman" w:cs="Times New Roman"/>
+          <w:sz w:val="28"/>
+          <w:szCs w:val="28"/>
         </w:rPr>
         <w:t xml:space="preserve">c. When was futsal game developed? </w:t>
       </w:r>
@@ -717,35 +1267,32 @@
       <w:pPr>
         <w:rPr>
           <w:rFonts w:ascii="Times New Roman" w:hAnsi="Times New Roman" w:cs="Times New Roman"/>
-          <w:szCs w:val="22"/>
-        </w:rPr>
-      </w:pPr>
-      <w:r>
-        <w:rPr>
-          <w:rFonts w:ascii="Times New Roman" w:hAnsi="Times New Roman" w:cs="Times New Roman"/>
-          <w:szCs w:val="22"/>
-        </w:rPr>
-        <w:t>………………………………………………………………………………………………………</w:t>
-      </w:r>
-      <w:r>
-        <w:rPr>
-          <w:rFonts w:ascii="Times New Roman" w:hAnsi="Times New Roman" w:cs="Times New Roman"/>
-          <w:szCs w:val="22"/>
-        </w:rPr>
-        <w:t>………..</w:t>
-      </w:r>
-    </w:p>
-    <w:p>
-      <w:pPr>
-        <w:rPr>
-          <w:rFonts w:ascii="Times New Roman" w:hAnsi="Times New Roman" w:cs="Times New Roman"/>
-          <w:szCs w:val="22"/>
-        </w:rPr>
-      </w:pPr>
-      <w:r>
-        <w:rPr>
-          <w:rFonts w:ascii="Times New Roman" w:hAnsi="Times New Roman" w:cs="Times New Roman"/>
-          <w:szCs w:val="22"/>
+          <w:sz w:val="28"/>
+          <w:szCs w:val="28"/>
+        </w:rPr>
+      </w:pPr>
+      <w:r>
+        <w:rPr>
+          <w:rFonts w:ascii="Times New Roman" w:hAnsi="Times New Roman" w:cs="Times New Roman"/>
+          <w:sz w:val="28"/>
+          <w:szCs w:val="28"/>
+        </w:rPr>
+        <w:t>…………………………………………………………………………………………………</w:t>
+      </w:r>
+    </w:p>
+    <w:p>
+      <w:pPr>
+        <w:rPr>
+          <w:rFonts w:ascii="Times New Roman" w:hAnsi="Times New Roman" w:cs="Times New Roman"/>
+          <w:sz w:val="28"/>
+          <w:szCs w:val="28"/>
+        </w:rPr>
+      </w:pPr>
+      <w:r>
+        <w:rPr>
+          <w:rFonts w:ascii="Times New Roman" w:hAnsi="Times New Roman" w:cs="Times New Roman"/>
+          <w:sz w:val="28"/>
+          <w:szCs w:val="28"/>
         </w:rPr>
         <w:t xml:space="preserve">d. What do you mean by trade? </w:t>
       </w:r>
@@ -754,35 +1301,32 @@
       <w:pPr>
         <w:rPr>
           <w:rFonts w:ascii="Times New Roman" w:hAnsi="Times New Roman" w:cs="Times New Roman"/>
-          <w:szCs w:val="22"/>
-        </w:rPr>
-      </w:pPr>
-      <w:r>
-        <w:rPr>
-          <w:rFonts w:ascii="Times New Roman" w:hAnsi="Times New Roman" w:cs="Times New Roman"/>
-          <w:szCs w:val="22"/>
-        </w:rPr>
-        <w:t>………………………………………………………………………………………………………</w:t>
-      </w:r>
-      <w:r>
-        <w:rPr>
-          <w:rFonts w:ascii="Times New Roman" w:hAnsi="Times New Roman" w:cs="Times New Roman"/>
-          <w:szCs w:val="22"/>
-        </w:rPr>
-        <w:t>………..</w:t>
-      </w:r>
-    </w:p>
-    <w:p>
-      <w:pPr>
-        <w:rPr>
-          <w:rFonts w:ascii="Times New Roman" w:hAnsi="Times New Roman" w:cs="Times New Roman"/>
-          <w:szCs w:val="22"/>
-        </w:rPr>
-      </w:pPr>
-      <w:r>
-        <w:rPr>
-          <w:rFonts w:ascii="Times New Roman" w:hAnsi="Times New Roman" w:cs="Times New Roman"/>
-          <w:szCs w:val="22"/>
+          <w:sz w:val="28"/>
+          <w:szCs w:val="28"/>
+        </w:rPr>
+      </w:pPr>
+      <w:r>
+        <w:rPr>
+          <w:rFonts w:ascii="Times New Roman" w:hAnsi="Times New Roman" w:cs="Times New Roman"/>
+          <w:sz w:val="28"/>
+          <w:szCs w:val="28"/>
+        </w:rPr>
+        <w:t>…………………………………………………………………………………………………</w:t>
+      </w:r>
+    </w:p>
+    <w:p>
+      <w:pPr>
+        <w:rPr>
+          <w:rFonts w:ascii="Times New Roman" w:hAnsi="Times New Roman" w:cs="Times New Roman"/>
+          <w:sz w:val="28"/>
+          <w:szCs w:val="28"/>
+        </w:rPr>
+      </w:pPr>
+      <w:r>
+        <w:rPr>
+          <w:rFonts w:ascii="Times New Roman" w:hAnsi="Times New Roman" w:cs="Times New Roman"/>
+          <w:sz w:val="28"/>
+          <w:szCs w:val="28"/>
         </w:rPr>
         <w:t>e. What is the main occupation of the people of Ratnanagar?</w:t>
       </w:r>
@@ -791,54 +1335,163 @@
       <w:pPr>
         <w:rPr>
           <w:rFonts w:ascii="Times New Roman" w:hAnsi="Times New Roman" w:cs="Times New Roman"/>
-          <w:szCs w:val="22"/>
-        </w:rPr>
-      </w:pPr>
-      <w:r>
-        <w:rPr>
-          <w:rFonts w:ascii="Times New Roman" w:hAnsi="Times New Roman" w:cs="Times New Roman"/>
-          <w:szCs w:val="22"/>
-        </w:rPr>
-        <w:t>………………………………………………………………………………………………………</w:t>
-      </w:r>
-      <w:r>
-        <w:rPr>
-          <w:rFonts w:ascii="Times New Roman" w:hAnsi="Times New Roman" w:cs="Times New Roman"/>
-          <w:szCs w:val="22"/>
-        </w:rPr>
-        <w:t>………..</w:t>
-      </w:r>
-    </w:p>
-    <w:p>
-      <w:pPr>
-        <w:rPr>
-          <w:rFonts w:ascii="Times New Roman" w:hAnsi="Times New Roman" w:cs="Times New Roman"/>
-          <w:b/>
-          <w:bCs/>
-          <w:szCs w:val="22"/>
-        </w:rPr>
-      </w:pPr>
-      <w:r>
-        <w:rPr>
-          <w:rFonts w:ascii="Times New Roman" w:hAnsi="Times New Roman" w:cs="Times New Roman"/>
-          <w:b/>
-          <w:bCs/>
-          <w:szCs w:val="22"/>
-        </w:rPr>
-        <w:t xml:space="preserve">2. Write short answers. (6×2=12) </w:t>
-      </w:r>
-    </w:p>
-    <w:p>
-      <w:pPr>
-        <w:rPr>
-          <w:rFonts w:ascii="Times New Roman" w:hAnsi="Times New Roman" w:cs="Times New Roman"/>
-          <w:szCs w:val="22"/>
-        </w:rPr>
-      </w:pPr>
-      <w:r>
-        <w:rPr>
-          <w:rFonts w:ascii="Times New Roman" w:hAnsi="Times New Roman" w:cs="Times New Roman"/>
-          <w:szCs w:val="22"/>
+          <w:sz w:val="28"/>
+          <w:szCs w:val="28"/>
+        </w:rPr>
+      </w:pPr>
+      <w:r>
+        <w:rPr>
+          <w:rFonts w:ascii="Times New Roman" w:hAnsi="Times New Roman" w:cs="Times New Roman"/>
+          <w:sz w:val="28"/>
+          <w:szCs w:val="28"/>
+        </w:rPr>
+        <w:t>…………………………………………………………………………………………………</w:t>
+      </w:r>
+    </w:p>
+    <w:p>
+      <w:pPr>
+        <w:rPr>
+          <w:rFonts w:ascii="Times New Roman" w:hAnsi="Times New Roman" w:cs="Times New Roman"/>
+          <w:b/>
+          <w:bCs/>
+          <w:sz w:val="28"/>
+          <w:szCs w:val="28"/>
+        </w:rPr>
+      </w:pPr>
+      <w:r>
+        <w:rPr>
+          <w:rFonts w:ascii="Times New Roman" w:hAnsi="Times New Roman" w:cs="Times New Roman"/>
+          <w:b/>
+          <w:bCs/>
+          <w:sz w:val="28"/>
+          <w:szCs w:val="28"/>
+        </w:rPr>
+        <w:t>2. Write short answers.</w:t>
+      </w:r>
+      <w:r>
+        <w:rPr>
+          <w:rFonts w:ascii="Times New Roman" w:hAnsi="Times New Roman" w:cs="Times New Roman"/>
+          <w:b/>
+          <w:bCs/>
+          <w:sz w:val="28"/>
+          <w:szCs w:val="28"/>
+        </w:rPr>
+        <w:tab/>
+      </w:r>
+      <w:r>
+        <w:rPr>
+          <w:rFonts w:ascii="Times New Roman" w:hAnsi="Times New Roman" w:cs="Times New Roman"/>
+          <w:b/>
+          <w:bCs/>
+          <w:sz w:val="28"/>
+          <w:szCs w:val="28"/>
+        </w:rPr>
+        <w:tab/>
+      </w:r>
+      <w:r>
+        <w:rPr>
+          <w:rFonts w:ascii="Times New Roman" w:hAnsi="Times New Roman" w:cs="Times New Roman"/>
+          <w:b/>
+          <w:bCs/>
+          <w:sz w:val="28"/>
+          <w:szCs w:val="28"/>
+        </w:rPr>
+        <w:tab/>
+      </w:r>
+      <w:r>
+        <w:rPr>
+          <w:rFonts w:ascii="Times New Roman" w:hAnsi="Times New Roman" w:cs="Times New Roman"/>
+          <w:b/>
+          <w:bCs/>
+          <w:sz w:val="28"/>
+          <w:szCs w:val="28"/>
+        </w:rPr>
+        <w:tab/>
+      </w:r>
+      <w:r>
+        <w:rPr>
+          <w:rFonts w:ascii="Times New Roman" w:hAnsi="Times New Roman" w:cs="Times New Roman"/>
+          <w:b/>
+          <w:bCs/>
+          <w:sz w:val="28"/>
+          <w:szCs w:val="28"/>
+        </w:rPr>
+        <w:tab/>
+      </w:r>
+      <w:r>
+        <w:rPr>
+          <w:rFonts w:ascii="Times New Roman" w:hAnsi="Times New Roman" w:cs="Times New Roman"/>
+          <w:b/>
+          <w:bCs/>
+          <w:sz w:val="28"/>
+          <w:szCs w:val="28"/>
+        </w:rPr>
+        <w:tab/>
+      </w:r>
+      <w:r>
+        <w:rPr>
+          <w:rFonts w:ascii="Times New Roman" w:hAnsi="Times New Roman" w:cs="Times New Roman"/>
+          <w:b/>
+          <w:bCs/>
+          <w:sz w:val="28"/>
+          <w:szCs w:val="28"/>
+        </w:rPr>
+        <w:tab/>
+      </w:r>
+      <w:r>
+        <w:rPr>
+          <w:rFonts w:ascii="Times New Roman" w:hAnsi="Times New Roman" w:cs="Times New Roman"/>
+          <w:b/>
+          <w:bCs/>
+          <w:sz w:val="28"/>
+          <w:szCs w:val="28"/>
+        </w:rPr>
+        <w:tab/>
+      </w:r>
+      <w:r>
+        <w:rPr>
+          <w:rFonts w:ascii="Times New Roman" w:hAnsi="Times New Roman" w:cs="Times New Roman"/>
+          <w:b/>
+          <w:bCs/>
+          <w:sz w:val="28"/>
+          <w:szCs w:val="28"/>
+        </w:rPr>
+        <w:tab/>
+      </w:r>
+      <w:r>
+        <w:rPr>
+          <w:rFonts w:ascii="Times New Roman" w:hAnsi="Times New Roman" w:cs="Times New Roman"/>
+          <w:b/>
+          <w:bCs/>
+          <w:sz w:val="28"/>
+          <w:szCs w:val="28"/>
+        </w:rPr>
+        <w:tab/>
+      </w:r>
+      <w:r>
+        <w:rPr>
+          <w:rFonts w:ascii="Times New Roman" w:hAnsi="Times New Roman" w:cs="Times New Roman"/>
+          <w:b/>
+          <w:bCs/>
+          <w:sz w:val="28"/>
+          <w:szCs w:val="28"/>
+        </w:rPr>
+        <w:t xml:space="preserve">(6×2=12) </w:t>
+      </w:r>
+    </w:p>
+    <w:p>
+      <w:pPr>
+        <w:rPr>
+          <w:rFonts w:ascii="Times New Roman" w:hAnsi="Times New Roman" w:cs="Times New Roman"/>
+          <w:sz w:val="28"/>
+          <w:szCs w:val="28"/>
+        </w:rPr>
+      </w:pPr>
+      <w:r>
+        <w:rPr>
+          <w:rFonts w:ascii="Times New Roman" w:hAnsi="Times New Roman" w:cs="Times New Roman"/>
+          <w:sz w:val="28"/>
+          <w:szCs w:val="28"/>
         </w:rPr>
         <w:t>a. What are the functions of the ward? (Any two)</w:t>
       </w:r>
@@ -847,79 +1500,75 @@
       <w:pPr>
         <w:rPr>
           <w:rFonts w:ascii="Times New Roman" w:hAnsi="Times New Roman" w:cs="Times New Roman"/>
-          <w:szCs w:val="22"/>
-        </w:rPr>
-      </w:pPr>
-      <w:r>
-        <w:rPr>
-          <w:rFonts w:ascii="Times New Roman" w:hAnsi="Times New Roman" w:cs="Times New Roman"/>
-          <w:szCs w:val="22"/>
-        </w:rPr>
-        <w:t>………………………………………………………………………………………………………</w:t>
-      </w:r>
-      <w:r>
-        <w:rPr>
-          <w:rFonts w:ascii="Times New Roman" w:hAnsi="Times New Roman" w:cs="Times New Roman"/>
-          <w:szCs w:val="22"/>
-        </w:rPr>
-        <w:t>………..</w:t>
-      </w:r>
-    </w:p>
-    <w:p>
-      <w:pPr>
-        <w:rPr>
-          <w:rFonts w:ascii="Times New Roman" w:hAnsi="Times New Roman" w:cs="Times New Roman"/>
-          <w:szCs w:val="22"/>
-        </w:rPr>
-      </w:pPr>
-      <w:r>
-        <w:rPr>
-          <w:rFonts w:ascii="Times New Roman" w:hAnsi="Times New Roman" w:cs="Times New Roman"/>
-          <w:szCs w:val="22"/>
-        </w:rPr>
-        <w:t>………………………………………………………………………………………………………</w:t>
-      </w:r>
-      <w:r>
-        <w:rPr>
-          <w:rFonts w:ascii="Times New Roman" w:hAnsi="Times New Roman" w:cs="Times New Roman"/>
-          <w:szCs w:val="22"/>
-        </w:rPr>
-        <w:t>………..</w:t>
-      </w:r>
-    </w:p>
-    <w:p>
-      <w:pPr>
-        <w:rPr>
-          <w:rFonts w:ascii="Times New Roman" w:hAnsi="Times New Roman" w:cs="Times New Roman"/>
-          <w:szCs w:val="22"/>
-        </w:rPr>
-      </w:pPr>
-      <w:r>
-        <w:rPr>
-          <w:rFonts w:ascii="Times New Roman" w:hAnsi="Times New Roman" w:cs="Times New Roman"/>
-          <w:szCs w:val="22"/>
-        </w:rPr>
-        <w:t>………………………………………………………………………………………………………</w:t>
-      </w:r>
-      <w:r>
-        <w:rPr>
-          <w:rFonts w:ascii="Times New Roman" w:hAnsi="Times New Roman" w:cs="Times New Roman"/>
-          <w:szCs w:val="22"/>
-        </w:rPr>
-        <w:t>………..</w:t>
-      </w:r>
-    </w:p>
-    <w:p>
-      <w:pPr>
-        <w:rPr>
-          <w:rFonts w:ascii="Times New Roman" w:hAnsi="Times New Roman" w:cs="Times New Roman"/>
-          <w:szCs w:val="22"/>
-        </w:rPr>
-      </w:pPr>
-      <w:r>
-        <w:rPr>
-          <w:rFonts w:ascii="Times New Roman" w:hAnsi="Times New Roman" w:cs="Times New Roman"/>
-          <w:szCs w:val="22"/>
+          <w:sz w:val="28"/>
+          <w:szCs w:val="28"/>
+        </w:rPr>
+      </w:pPr>
+      <w:r>
+        <w:rPr>
+          <w:rFonts w:ascii="Times New Roman" w:hAnsi="Times New Roman" w:cs="Times New Roman"/>
+          <w:sz w:val="28"/>
+          <w:szCs w:val="28"/>
+        </w:rPr>
+        <w:t>…………………………………………………………………………………………………</w:t>
+      </w:r>
+    </w:p>
+    <w:p>
+      <w:pPr>
+        <w:rPr>
+          <w:rFonts w:ascii="Times New Roman" w:hAnsi="Times New Roman" w:cs="Times New Roman"/>
+          <w:sz w:val="28"/>
+          <w:szCs w:val="28"/>
+        </w:rPr>
+      </w:pPr>
+      <w:r>
+        <w:rPr>
+          <w:rFonts w:ascii="Times New Roman" w:hAnsi="Times New Roman" w:cs="Times New Roman"/>
+          <w:sz w:val="28"/>
+          <w:szCs w:val="28"/>
+        </w:rPr>
+        <w:t>………………………………………………………………………………………………….</w:t>
+      </w:r>
+    </w:p>
+    <w:p>
+      <w:pPr>
+        <w:rPr>
+          <w:rFonts w:ascii="Times New Roman" w:hAnsi="Times New Roman" w:cs="Times New Roman"/>
+          <w:sz w:val="28"/>
+          <w:szCs w:val="28"/>
+        </w:rPr>
+      </w:pPr>
+      <w:r>
+        <w:rPr>
+          <w:rFonts w:ascii="Times New Roman" w:hAnsi="Times New Roman" w:cs="Times New Roman"/>
+          <w:sz w:val="28"/>
+          <w:szCs w:val="28"/>
+        </w:rPr>
+        <w:t>…………………………………………………………………………………………………</w:t>
+      </w:r>
+    </w:p>
+    <w:p>
+      <w:pPr>
+        <w:rPr>
+          <w:rFonts w:ascii="Times New Roman" w:hAnsi="Times New Roman" w:cs="Times New Roman"/>
+          <w:sz w:val="28"/>
+          <w:szCs w:val="28"/>
+        </w:rPr>
+      </w:pPr>
+    </w:p>
+    <w:p>
+      <w:pPr>
+        <w:rPr>
+          <w:rFonts w:ascii="Times New Roman" w:hAnsi="Times New Roman" w:cs="Times New Roman"/>
+          <w:sz w:val="28"/>
+          <w:szCs w:val="28"/>
+        </w:rPr>
+      </w:pPr>
+      <w:r>
+        <w:rPr>
+          <w:rFonts w:ascii="Times New Roman" w:hAnsi="Times New Roman" w:cs="Times New Roman"/>
+          <w:sz w:val="28"/>
+          <w:szCs w:val="28"/>
         </w:rPr>
         <w:t xml:space="preserve">b. How do you celebrate the Tihar festival? </w:t>
       </w:r>
@@ -928,80 +1577,68 @@
       <w:pPr>
         <w:rPr>
           <w:rFonts w:ascii="Times New Roman" w:hAnsi="Times New Roman" w:cs="Times New Roman"/>
-          <w:szCs w:val="22"/>
-        </w:rPr>
-      </w:pPr>
-      <w:r>
-        <w:rPr>
-          <w:rFonts w:ascii="Times New Roman" w:hAnsi="Times New Roman" w:cs="Times New Roman"/>
-          <w:szCs w:val="22"/>
-        </w:rPr>
-        <w:t>………………………………………………………………………………………………………</w:t>
-      </w:r>
-      <w:r>
-        <w:rPr>
-          <w:rFonts w:ascii="Times New Roman" w:hAnsi="Times New Roman" w:cs="Times New Roman"/>
-          <w:szCs w:val="22"/>
-        </w:rPr>
-        <w:t>………..</w:t>
-      </w:r>
-    </w:p>
-    <w:p>
-      <w:pPr>
-        <w:rPr>
-          <w:rFonts w:ascii="Times New Roman" w:hAnsi="Times New Roman" w:cs="Times New Roman"/>
-          <w:szCs w:val="22"/>
-        </w:rPr>
-      </w:pPr>
-      <w:r>
-        <w:rPr>
-          <w:rFonts w:ascii="Times New Roman" w:hAnsi="Times New Roman" w:cs="Times New Roman"/>
-          <w:szCs w:val="22"/>
-        </w:rPr>
-        <w:t>………………………………………………………………………………………………………</w:t>
-      </w:r>
-      <w:r>
-        <w:rPr>
-          <w:rFonts w:ascii="Times New Roman" w:hAnsi="Times New Roman" w:cs="Times New Roman"/>
-          <w:szCs w:val="22"/>
-        </w:rPr>
-        <w:t>………..</w:t>
-      </w:r>
-    </w:p>
-    <w:p>
-      <w:pPr>
-        <w:rPr>
-          <w:rFonts w:ascii="Times New Roman" w:hAnsi="Times New Roman" w:cs="Times New Roman"/>
-          <w:szCs w:val="22"/>
-        </w:rPr>
-      </w:pPr>
-      <w:r>
-        <w:rPr>
-          <w:rFonts w:ascii="Times New Roman" w:hAnsi="Times New Roman" w:cs="Times New Roman"/>
-          <w:szCs w:val="22"/>
-        </w:rPr>
-        <w:t>………………………………………………………………………………………………………</w:t>
-      </w:r>
-      <w:r>
-        <w:rPr>
-          <w:rFonts w:ascii="Times New Roman" w:hAnsi="Times New Roman" w:cs="Times New Roman"/>
-          <w:szCs w:val="22"/>
-        </w:rPr>
-        <w:t>………..</w:t>
-      </w:r>
-    </w:p>
-    <w:p>
-      <w:pPr>
-        <w:rPr>
-          <w:rFonts w:ascii="Times New Roman" w:hAnsi="Times New Roman" w:cs="Times New Roman"/>
-          <w:szCs w:val="22"/>
-        </w:rPr>
-      </w:pPr>
-      <w:r>
-        <w:rPr>
-          <w:rFonts w:ascii="Times New Roman" w:hAnsi="Times New Roman" w:cs="Times New Roman"/>
-          <w:szCs w:val="22"/>
-        </w:rPr>
+          <w:sz w:val="28"/>
+          <w:szCs w:val="28"/>
+        </w:rPr>
+      </w:pPr>
+      <w:r>
+        <w:rPr>
+          <w:rFonts w:ascii="Times New Roman" w:hAnsi="Times New Roman" w:cs="Times New Roman"/>
+          <w:sz w:val="28"/>
+          <w:szCs w:val="28"/>
+        </w:rPr>
+        <w:t>…………………………………………………………………………………………………</w:t>
+      </w:r>
+    </w:p>
+    <w:p>
+      <w:pPr>
+        <w:rPr>
+          <w:rFonts w:ascii="Times New Roman" w:hAnsi="Times New Roman" w:cs="Times New Roman"/>
+          <w:sz w:val="28"/>
+          <w:szCs w:val="28"/>
+        </w:rPr>
+      </w:pPr>
+      <w:r>
+        <w:rPr>
+          <w:rFonts w:ascii="Times New Roman" w:hAnsi="Times New Roman" w:cs="Times New Roman"/>
+          <w:sz w:val="28"/>
+          <w:szCs w:val="28"/>
+        </w:rPr>
+        <w:t>…………………………………………………………………………………………………</w:t>
+      </w:r>
+    </w:p>
+    <w:p>
+      <w:pPr>
+        <w:rPr>
+          <w:rFonts w:ascii="Times New Roman" w:hAnsi="Times New Roman" w:cs="Times New Roman"/>
+          <w:sz w:val="28"/>
+          <w:szCs w:val="28"/>
+        </w:rPr>
+      </w:pPr>
+      <w:r>
+        <w:rPr>
+          <w:rFonts w:ascii="Times New Roman" w:hAnsi="Times New Roman" w:cs="Times New Roman"/>
+          <w:sz w:val="28"/>
+          <w:szCs w:val="28"/>
+        </w:rPr>
+        <w:t>…………………………………………………………………………………………………</w:t>
+      </w:r>
+    </w:p>
+    <w:p>
+      <w:pPr>
+        <w:rPr>
+          <w:rFonts w:ascii="Times New Roman" w:hAnsi="Times New Roman" w:cs="Times New Roman"/>
+          <w:sz w:val="28"/>
+          <w:szCs w:val="28"/>
+        </w:rPr>
+      </w:pPr>
+      <w:r>
+        <w:rPr>
+          <w:rFonts w:ascii="Times New Roman" w:hAnsi="Times New Roman" w:cs="Times New Roman"/>
+          <w:sz w:val="28"/>
+          <w:szCs w:val="28"/>
+        </w:rPr>
+        <w:lastRenderedPageBreak/>
         <w:t xml:space="preserve">c. Write any two medicinal herbs lies in your house. </w:t>
       </w:r>
     </w:p>
@@ -1009,79 +1646,49 @@
       <w:pPr>
         <w:rPr>
           <w:rFonts w:ascii="Times New Roman" w:hAnsi="Times New Roman" w:cs="Times New Roman"/>
-          <w:szCs w:val="22"/>
-        </w:rPr>
-      </w:pPr>
-      <w:r>
-        <w:rPr>
-          <w:rFonts w:ascii="Times New Roman" w:hAnsi="Times New Roman" w:cs="Times New Roman"/>
-          <w:szCs w:val="22"/>
-        </w:rPr>
-        <w:t>………………………………………………………………………………………………………</w:t>
-      </w:r>
-      <w:r>
-        <w:rPr>
-          <w:rFonts w:ascii="Times New Roman" w:hAnsi="Times New Roman" w:cs="Times New Roman"/>
-          <w:szCs w:val="22"/>
-        </w:rPr>
-        <w:t>………..</w:t>
-      </w:r>
-    </w:p>
-    <w:p>
-      <w:pPr>
-        <w:rPr>
-          <w:rFonts w:ascii="Times New Roman" w:hAnsi="Times New Roman" w:cs="Times New Roman"/>
-          <w:szCs w:val="22"/>
-        </w:rPr>
-      </w:pPr>
-      <w:r>
-        <w:rPr>
-          <w:rFonts w:ascii="Times New Roman" w:hAnsi="Times New Roman" w:cs="Times New Roman"/>
-          <w:szCs w:val="22"/>
-        </w:rPr>
-        <w:t>………………………………………………………………………………………………………</w:t>
-      </w:r>
-      <w:r>
-        <w:rPr>
-          <w:rFonts w:ascii="Times New Roman" w:hAnsi="Times New Roman" w:cs="Times New Roman"/>
-          <w:szCs w:val="22"/>
-        </w:rPr>
-        <w:t>………..</w:t>
-      </w:r>
-    </w:p>
-    <w:p>
-      <w:pPr>
-        <w:rPr>
-          <w:rFonts w:ascii="Times New Roman" w:hAnsi="Times New Roman" w:cs="Times New Roman"/>
-          <w:szCs w:val="22"/>
-        </w:rPr>
-      </w:pPr>
-      <w:r>
-        <w:rPr>
-          <w:rFonts w:ascii="Times New Roman" w:hAnsi="Times New Roman" w:cs="Times New Roman"/>
-          <w:szCs w:val="22"/>
-        </w:rPr>
-        <w:t>………………………………………………………………………………………………………</w:t>
-      </w:r>
-      <w:r>
-        <w:rPr>
-          <w:rFonts w:ascii="Times New Roman" w:hAnsi="Times New Roman" w:cs="Times New Roman"/>
-          <w:szCs w:val="22"/>
-        </w:rPr>
-        <w:t>………..</w:t>
-      </w:r>
-    </w:p>
-    <w:p>
-      <w:pPr>
-        <w:rPr>
-          <w:rFonts w:ascii="Times New Roman" w:hAnsi="Times New Roman" w:cs="Times New Roman"/>
-          <w:szCs w:val="22"/>
-        </w:rPr>
-      </w:pPr>
-      <w:r>
-        <w:rPr>
-          <w:rFonts w:ascii="Times New Roman" w:hAnsi="Times New Roman" w:cs="Times New Roman"/>
-          <w:szCs w:val="22"/>
+          <w:sz w:val="28"/>
+          <w:szCs w:val="28"/>
+        </w:rPr>
+      </w:pPr>
+      <w:r>
+        <w:rPr>
+          <w:rFonts w:ascii="Times New Roman" w:hAnsi="Times New Roman" w:cs="Times New Roman"/>
+          <w:sz w:val="28"/>
+          <w:szCs w:val="28"/>
+        </w:rPr>
+        <w:t>…………………………………………………………………………………………………</w:t>
+      </w:r>
+    </w:p>
+    <w:p>
+      <w:pPr>
+        <w:rPr>
+          <w:rFonts w:ascii="Times New Roman" w:hAnsi="Times New Roman" w:cs="Times New Roman"/>
+          <w:sz w:val="28"/>
+          <w:szCs w:val="28"/>
+        </w:rPr>
+      </w:pPr>
+      <w:r>
+        <w:rPr>
+          <w:rFonts w:ascii="Times New Roman" w:hAnsi="Times New Roman" w:cs="Times New Roman"/>
+          <w:sz w:val="28"/>
+          <w:szCs w:val="28"/>
+        </w:rPr>
+        <w:t>…………………………………………………………………………………………………</w:t>
+      </w:r>
+    </w:p>
+    <w:p>
+      <w:pPr>
+        <w:rPr>
+          <w:rFonts w:ascii="Times New Roman" w:hAnsi="Times New Roman" w:cs="Times New Roman"/>
+          <w:sz w:val="28"/>
+          <w:szCs w:val="28"/>
+        </w:rPr>
+      </w:pPr>
+      <w:r>
+        <w:rPr>
+          <w:rFonts w:ascii="Times New Roman" w:hAnsi="Times New Roman" w:cs="Times New Roman"/>
+          <w:sz w:val="28"/>
+          <w:szCs w:val="28"/>
         </w:rPr>
         <w:t xml:space="preserve">d. What are the advantages of games and yoga? (Any two) </w:t>
       </w:r>
@@ -1090,79 +1697,66 @@
       <w:pPr>
         <w:rPr>
           <w:rFonts w:ascii="Times New Roman" w:hAnsi="Times New Roman" w:cs="Times New Roman"/>
-          <w:szCs w:val="22"/>
-        </w:rPr>
-      </w:pPr>
-      <w:r>
-        <w:rPr>
-          <w:rFonts w:ascii="Times New Roman" w:hAnsi="Times New Roman" w:cs="Times New Roman"/>
-          <w:szCs w:val="22"/>
-        </w:rPr>
-        <w:t>………………………………………………………………………………………………………</w:t>
-      </w:r>
-      <w:r>
-        <w:rPr>
-          <w:rFonts w:ascii="Times New Roman" w:hAnsi="Times New Roman" w:cs="Times New Roman"/>
-          <w:szCs w:val="22"/>
-        </w:rPr>
-        <w:t>………..</w:t>
-      </w:r>
-    </w:p>
-    <w:p>
-      <w:pPr>
-        <w:rPr>
-          <w:rFonts w:ascii="Times New Roman" w:hAnsi="Times New Roman" w:cs="Times New Roman"/>
-          <w:szCs w:val="22"/>
-        </w:rPr>
-      </w:pPr>
-      <w:r>
-        <w:rPr>
-          <w:rFonts w:ascii="Times New Roman" w:hAnsi="Times New Roman" w:cs="Times New Roman"/>
-          <w:szCs w:val="22"/>
-        </w:rPr>
-        <w:t>………………………………………………………………………………………………………</w:t>
-      </w:r>
-      <w:r>
-        <w:rPr>
-          <w:rFonts w:ascii="Times New Roman" w:hAnsi="Times New Roman" w:cs="Times New Roman"/>
-          <w:szCs w:val="22"/>
-        </w:rPr>
-        <w:t>………..</w:t>
-      </w:r>
-    </w:p>
-    <w:p>
-      <w:pPr>
-        <w:rPr>
-          <w:rFonts w:ascii="Times New Roman" w:hAnsi="Times New Roman" w:cs="Times New Roman"/>
-          <w:szCs w:val="22"/>
-        </w:rPr>
-      </w:pPr>
-      <w:r>
-        <w:rPr>
-          <w:rFonts w:ascii="Times New Roman" w:hAnsi="Times New Roman" w:cs="Times New Roman"/>
-          <w:szCs w:val="22"/>
-        </w:rPr>
-        <w:t>………………………………………………………………………………………………………</w:t>
-      </w:r>
-      <w:r>
-        <w:rPr>
-          <w:rFonts w:ascii="Times New Roman" w:hAnsi="Times New Roman" w:cs="Times New Roman"/>
-          <w:szCs w:val="22"/>
-        </w:rPr>
-        <w:t>………..</w:t>
-      </w:r>
-    </w:p>
-    <w:p>
-      <w:pPr>
-        <w:rPr>
-          <w:rFonts w:ascii="Times New Roman" w:hAnsi="Times New Roman" w:cs="Times New Roman"/>
-          <w:szCs w:val="22"/>
-        </w:rPr>
-      </w:pPr>
-      <w:r>
-        <w:rPr>
-          <w:rFonts w:ascii="Times New Roman" w:hAnsi="Times New Roman" w:cs="Times New Roman"/>
-          <w:szCs w:val="22"/>
+          <w:sz w:val="28"/>
+          <w:szCs w:val="28"/>
+        </w:rPr>
+      </w:pPr>
+      <w:r>
+        <w:rPr>
+          <w:rFonts w:ascii="Times New Roman" w:hAnsi="Times New Roman" w:cs="Times New Roman"/>
+          <w:sz w:val="28"/>
+          <w:szCs w:val="28"/>
+        </w:rPr>
+        <w:t>…………………………………………………………………………………………………</w:t>
+      </w:r>
+    </w:p>
+    <w:p>
+      <w:pPr>
+        <w:rPr>
+          <w:rFonts w:ascii="Times New Roman" w:hAnsi="Times New Roman" w:cs="Times New Roman"/>
+          <w:sz w:val="28"/>
+          <w:szCs w:val="28"/>
+        </w:rPr>
+      </w:pPr>
+      <w:r>
+        <w:rPr>
+          <w:rFonts w:ascii="Times New Roman" w:hAnsi="Times New Roman" w:cs="Times New Roman"/>
+          <w:sz w:val="28"/>
+          <w:szCs w:val="28"/>
+        </w:rPr>
+        <w:t>…………………………………………………………………………………………………</w:t>
+      </w:r>
+    </w:p>
+    <w:p>
+      <w:pPr>
+        <w:rPr>
+          <w:rFonts w:ascii="Times New Roman" w:hAnsi="Times New Roman" w:cs="Times New Roman"/>
+          <w:sz w:val="28"/>
+          <w:szCs w:val="28"/>
+        </w:rPr>
+      </w:pPr>
+      <w:r>
+        <w:rPr>
+          <w:rFonts w:ascii="Times New Roman" w:hAnsi="Times New Roman" w:cs="Times New Roman"/>
+          <w:sz w:val="28"/>
+          <w:szCs w:val="28"/>
+        </w:rPr>
+        <w:t>…………………………………………………………………………………………………</w:t>
+      </w:r>
+    </w:p>
+    <w:p>
+      <w:pPr>
+        <w:rPr>
+          <w:rFonts w:ascii="Times New Roman" w:hAnsi="Times New Roman" w:cs="Times New Roman"/>
+          <w:sz w:val="28"/>
+          <w:szCs w:val="28"/>
+        </w:rPr>
+      </w:pPr>
+      <w:r>
+        <w:rPr>
+          <w:rFonts w:ascii="Times New Roman" w:hAnsi="Times New Roman" w:cs="Times New Roman"/>
+          <w:sz w:val="28"/>
+          <w:szCs w:val="28"/>
         </w:rPr>
         <w:t>e. Write any two importance of elephant festival.</w:t>
       </w:r>
@@ -1171,79 +1765,66 @@
       <w:pPr>
         <w:rPr>
           <w:rFonts w:ascii="Times New Roman" w:hAnsi="Times New Roman" w:cs="Times New Roman"/>
-          <w:szCs w:val="22"/>
-        </w:rPr>
-      </w:pPr>
-      <w:r>
-        <w:rPr>
-          <w:rFonts w:ascii="Times New Roman" w:hAnsi="Times New Roman" w:cs="Times New Roman"/>
-          <w:szCs w:val="22"/>
-        </w:rPr>
-        <w:t>………………………………………………………………………………………………………</w:t>
-      </w:r>
-      <w:r>
-        <w:rPr>
-          <w:rFonts w:ascii="Times New Roman" w:hAnsi="Times New Roman" w:cs="Times New Roman"/>
-          <w:szCs w:val="22"/>
-        </w:rPr>
-        <w:t>………..</w:t>
-      </w:r>
-    </w:p>
-    <w:p>
-      <w:pPr>
-        <w:rPr>
-          <w:rFonts w:ascii="Times New Roman" w:hAnsi="Times New Roman" w:cs="Times New Roman"/>
-          <w:szCs w:val="22"/>
-        </w:rPr>
-      </w:pPr>
-      <w:r>
-        <w:rPr>
-          <w:rFonts w:ascii="Times New Roman" w:hAnsi="Times New Roman" w:cs="Times New Roman"/>
-          <w:szCs w:val="22"/>
-        </w:rPr>
-        <w:t>………………………………………………………………………………………………………</w:t>
-      </w:r>
-      <w:r>
-        <w:rPr>
-          <w:rFonts w:ascii="Times New Roman" w:hAnsi="Times New Roman" w:cs="Times New Roman"/>
-          <w:szCs w:val="22"/>
-        </w:rPr>
-        <w:t>………..</w:t>
-      </w:r>
-    </w:p>
-    <w:p>
-      <w:pPr>
-        <w:rPr>
-          <w:rFonts w:ascii="Times New Roman" w:hAnsi="Times New Roman" w:cs="Times New Roman"/>
-          <w:szCs w:val="22"/>
-        </w:rPr>
-      </w:pPr>
-      <w:r>
-        <w:rPr>
-          <w:rFonts w:ascii="Times New Roman" w:hAnsi="Times New Roman" w:cs="Times New Roman"/>
-          <w:szCs w:val="22"/>
-        </w:rPr>
-        <w:t>………………………………………………………………………………………………………</w:t>
-      </w:r>
-      <w:r>
-        <w:rPr>
-          <w:rFonts w:ascii="Times New Roman" w:hAnsi="Times New Roman" w:cs="Times New Roman"/>
-          <w:szCs w:val="22"/>
-        </w:rPr>
-        <w:t>………..</w:t>
-      </w:r>
-    </w:p>
-    <w:p>
-      <w:pPr>
-        <w:rPr>
-          <w:rFonts w:ascii="Times New Roman" w:hAnsi="Times New Roman" w:cs="Times New Roman"/>
-          <w:szCs w:val="22"/>
-        </w:rPr>
-      </w:pPr>
-      <w:r>
-        <w:rPr>
-          <w:rFonts w:ascii="Times New Roman" w:hAnsi="Times New Roman" w:cs="Times New Roman"/>
-          <w:szCs w:val="22"/>
+          <w:sz w:val="28"/>
+          <w:szCs w:val="28"/>
+        </w:rPr>
+      </w:pPr>
+      <w:r>
+        <w:rPr>
+          <w:rFonts w:ascii="Times New Roman" w:hAnsi="Times New Roman" w:cs="Times New Roman"/>
+          <w:sz w:val="28"/>
+          <w:szCs w:val="28"/>
+        </w:rPr>
+        <w:t>…………………………………………………………………………………………………</w:t>
+      </w:r>
+    </w:p>
+    <w:p>
+      <w:pPr>
+        <w:rPr>
+          <w:rFonts w:ascii="Times New Roman" w:hAnsi="Times New Roman" w:cs="Times New Roman"/>
+          <w:sz w:val="28"/>
+          <w:szCs w:val="28"/>
+        </w:rPr>
+      </w:pPr>
+      <w:r>
+        <w:rPr>
+          <w:rFonts w:ascii="Times New Roman" w:hAnsi="Times New Roman" w:cs="Times New Roman"/>
+          <w:sz w:val="28"/>
+          <w:szCs w:val="28"/>
+        </w:rPr>
+        <w:t>…………………………………………………………………………………………………</w:t>
+      </w:r>
+    </w:p>
+    <w:p>
+      <w:pPr>
+        <w:rPr>
+          <w:rFonts w:ascii="Times New Roman" w:hAnsi="Times New Roman" w:cs="Times New Roman"/>
+          <w:sz w:val="28"/>
+          <w:szCs w:val="28"/>
+        </w:rPr>
+      </w:pPr>
+      <w:r>
+        <w:rPr>
+          <w:rFonts w:ascii="Times New Roman" w:hAnsi="Times New Roman" w:cs="Times New Roman"/>
+          <w:sz w:val="28"/>
+          <w:szCs w:val="28"/>
+        </w:rPr>
+        <w:t>…………………………………………………………………………………………………</w:t>
+      </w:r>
+    </w:p>
+    <w:p>
+      <w:pPr>
+        <w:rPr>
+          <w:rFonts w:ascii="Times New Roman" w:hAnsi="Times New Roman" w:cs="Times New Roman"/>
+          <w:sz w:val="28"/>
+          <w:szCs w:val="28"/>
+        </w:rPr>
+      </w:pPr>
+      <w:r>
+        <w:rPr>
+          <w:rFonts w:ascii="Times New Roman" w:hAnsi="Times New Roman" w:cs="Times New Roman"/>
+          <w:sz w:val="28"/>
+          <w:szCs w:val="28"/>
         </w:rPr>
         <w:t>f. Make a list of any four livestock farming.</w:t>
       </w:r>
@@ -1252,112 +1833,233 @@
       <w:pPr>
         <w:rPr>
           <w:rFonts w:ascii="Times New Roman" w:hAnsi="Times New Roman" w:cs="Times New Roman"/>
-          <w:szCs w:val="22"/>
-        </w:rPr>
-      </w:pPr>
-      <w:r>
-        <w:rPr>
-          <w:rFonts w:ascii="Times New Roman" w:hAnsi="Times New Roman" w:cs="Times New Roman"/>
-          <w:szCs w:val="22"/>
-        </w:rPr>
-        <w:t>………………………………………………………………………………………………………</w:t>
-      </w:r>
-      <w:r>
-        <w:rPr>
-          <w:rFonts w:ascii="Times New Roman" w:hAnsi="Times New Roman" w:cs="Times New Roman"/>
-          <w:szCs w:val="22"/>
-        </w:rPr>
-        <w:t>………..</w:t>
-      </w:r>
-    </w:p>
-    <w:p>
-      <w:pPr>
-        <w:rPr>
-          <w:rFonts w:ascii="Times New Roman" w:hAnsi="Times New Roman" w:cs="Times New Roman"/>
-          <w:szCs w:val="22"/>
-        </w:rPr>
-      </w:pPr>
-      <w:r>
-        <w:rPr>
-          <w:rFonts w:ascii="Times New Roman" w:hAnsi="Times New Roman" w:cs="Times New Roman"/>
-          <w:szCs w:val="22"/>
-        </w:rPr>
-        <w:t>………………………………………………………………………………………………………</w:t>
-      </w:r>
-      <w:r>
-        <w:rPr>
-          <w:rFonts w:ascii="Times New Roman" w:hAnsi="Times New Roman" w:cs="Times New Roman"/>
-          <w:szCs w:val="22"/>
-        </w:rPr>
-        <w:t>………..</w:t>
-      </w:r>
-    </w:p>
-    <w:p>
-      <w:pPr>
-        <w:rPr>
-          <w:rFonts w:ascii="Times New Roman" w:hAnsi="Times New Roman" w:cs="Times New Roman"/>
-          <w:szCs w:val="22"/>
-        </w:rPr>
-      </w:pPr>
-      <w:r>
-        <w:rPr>
-          <w:rFonts w:ascii="Times New Roman" w:hAnsi="Times New Roman" w:cs="Times New Roman"/>
-          <w:szCs w:val="22"/>
-        </w:rPr>
-        <w:t>………………………………………………………………………………………………………</w:t>
-      </w:r>
-      <w:r>
-        <w:rPr>
-          <w:rFonts w:ascii="Times New Roman" w:hAnsi="Times New Roman" w:cs="Times New Roman"/>
-          <w:szCs w:val="22"/>
-        </w:rPr>
-        <w:t>………..</w:t>
-      </w:r>
-    </w:p>
-    <w:p>
-      <w:pPr>
-        <w:rPr>
-          <w:rFonts w:ascii="Times New Roman" w:hAnsi="Times New Roman" w:cs="Times New Roman"/>
-          <w:b/>
-          <w:bCs/>
-          <w:szCs w:val="22"/>
-        </w:rPr>
-      </w:pPr>
-      <w:r>
-        <w:rPr>
-          <w:rFonts w:ascii="Times New Roman" w:hAnsi="Times New Roman" w:cs="Times New Roman"/>
-          <w:b/>
-          <w:bCs/>
-          <w:szCs w:val="22"/>
-        </w:rPr>
-        <w:t xml:space="preserve">3.Write long answers (4×2=8) </w:t>
-      </w:r>
-    </w:p>
-    <w:p>
-      <w:pPr>
-        <w:rPr>
-          <w:rFonts w:ascii="Times New Roman" w:hAnsi="Times New Roman" w:cs="Times New Roman"/>
-          <w:szCs w:val="22"/>
-        </w:rPr>
-      </w:pPr>
-      <w:r>
-        <w:rPr>
-          <w:rFonts w:ascii="Times New Roman" w:hAnsi="Times New Roman" w:cs="Times New Roman"/>
-          <w:szCs w:val="22"/>
+          <w:sz w:val="28"/>
+          <w:szCs w:val="28"/>
+        </w:rPr>
+      </w:pPr>
+      <w:r>
+        <w:rPr>
+          <w:rFonts w:ascii="Times New Roman" w:hAnsi="Times New Roman" w:cs="Times New Roman"/>
+          <w:sz w:val="28"/>
+          <w:szCs w:val="28"/>
+        </w:rPr>
+        <w:t>…………………………………………………………………………………………………</w:t>
+      </w:r>
+    </w:p>
+    <w:p>
+      <w:pPr>
+        <w:rPr>
+          <w:rFonts w:ascii="Times New Roman" w:hAnsi="Times New Roman" w:cs="Times New Roman"/>
+          <w:sz w:val="28"/>
+          <w:szCs w:val="28"/>
+        </w:rPr>
+      </w:pPr>
+      <w:r>
+        <w:rPr>
+          <w:rFonts w:ascii="Times New Roman" w:hAnsi="Times New Roman" w:cs="Times New Roman"/>
+          <w:sz w:val="28"/>
+          <w:szCs w:val="28"/>
+        </w:rPr>
+        <w:t>…………………………………………………………………………………………………</w:t>
+      </w:r>
+    </w:p>
+    <w:p>
+      <w:pPr>
+        <w:rPr>
+          <w:rFonts w:ascii="Times New Roman" w:hAnsi="Times New Roman" w:cs="Times New Roman"/>
+          <w:sz w:val="28"/>
+          <w:szCs w:val="28"/>
+        </w:rPr>
+      </w:pPr>
+      <w:r>
+        <w:rPr>
+          <w:rFonts w:ascii="Times New Roman" w:hAnsi="Times New Roman" w:cs="Times New Roman"/>
+          <w:sz w:val="28"/>
+          <w:szCs w:val="28"/>
+        </w:rPr>
+        <w:t>…………………………………………………………………………………………………</w:t>
+      </w:r>
+    </w:p>
+    <w:p>
+      <w:pPr>
+        <w:rPr>
+          <w:rFonts w:ascii="Times New Roman" w:hAnsi="Times New Roman" w:cs="Times New Roman"/>
+          <w:b/>
+          <w:bCs/>
+          <w:sz w:val="28"/>
+          <w:szCs w:val="28"/>
+        </w:rPr>
+      </w:pPr>
+      <w:r>
+        <w:rPr>
+          <w:rFonts w:ascii="Times New Roman" w:hAnsi="Times New Roman" w:cs="Times New Roman"/>
+          <w:b/>
+          <w:bCs/>
+          <w:sz w:val="28"/>
+          <w:szCs w:val="28"/>
+        </w:rPr>
+        <w:t>3.</w:t>
+      </w:r>
+      <w:r>
+        <w:rPr>
+          <w:rFonts w:ascii="Times New Roman" w:hAnsi="Times New Roman" w:cs="Times New Roman"/>
+          <w:b/>
+          <w:bCs/>
+          <w:sz w:val="28"/>
+          <w:szCs w:val="28"/>
+        </w:rPr>
+        <w:t xml:space="preserve"> </w:t>
+      </w:r>
+      <w:r>
+        <w:rPr>
+          <w:rFonts w:ascii="Times New Roman" w:hAnsi="Times New Roman" w:cs="Times New Roman"/>
+          <w:b/>
+          <w:bCs/>
+          <w:sz w:val="28"/>
+          <w:szCs w:val="28"/>
+        </w:rPr>
+        <w:t>Write long answers</w:t>
+      </w:r>
+      <w:r>
+        <w:rPr>
+          <w:rFonts w:ascii="Times New Roman" w:hAnsi="Times New Roman" w:cs="Times New Roman"/>
+          <w:b/>
+          <w:bCs/>
+          <w:sz w:val="28"/>
+          <w:szCs w:val="28"/>
+        </w:rPr>
+        <w:t>.</w:t>
+      </w:r>
+      <w:r>
+        <w:rPr>
+          <w:rFonts w:ascii="Times New Roman" w:hAnsi="Times New Roman" w:cs="Times New Roman"/>
+          <w:b/>
+          <w:bCs/>
+          <w:sz w:val="28"/>
+          <w:szCs w:val="28"/>
+        </w:rPr>
+        <w:tab/>
+      </w:r>
+      <w:r>
+        <w:rPr>
+          <w:rFonts w:ascii="Times New Roman" w:hAnsi="Times New Roman" w:cs="Times New Roman"/>
+          <w:b/>
+          <w:bCs/>
+          <w:sz w:val="28"/>
+          <w:szCs w:val="28"/>
+        </w:rPr>
+        <w:tab/>
+      </w:r>
+      <w:r>
+        <w:rPr>
+          <w:rFonts w:ascii="Times New Roman" w:hAnsi="Times New Roman" w:cs="Times New Roman"/>
+          <w:b/>
+          <w:bCs/>
+          <w:sz w:val="28"/>
+          <w:szCs w:val="28"/>
+        </w:rPr>
+        <w:tab/>
+      </w:r>
+      <w:r>
+        <w:rPr>
+          <w:rFonts w:ascii="Times New Roman" w:hAnsi="Times New Roman" w:cs="Times New Roman"/>
+          <w:b/>
+          <w:bCs/>
+          <w:sz w:val="28"/>
+          <w:szCs w:val="28"/>
+        </w:rPr>
+        <w:tab/>
+      </w:r>
+      <w:r>
+        <w:rPr>
+          <w:rFonts w:ascii="Times New Roman" w:hAnsi="Times New Roman" w:cs="Times New Roman"/>
+          <w:b/>
+          <w:bCs/>
+          <w:sz w:val="28"/>
+          <w:szCs w:val="28"/>
+        </w:rPr>
+        <w:tab/>
+      </w:r>
+      <w:r>
+        <w:rPr>
+          <w:rFonts w:ascii="Times New Roman" w:hAnsi="Times New Roman" w:cs="Times New Roman"/>
+          <w:b/>
+          <w:bCs/>
+          <w:sz w:val="28"/>
+          <w:szCs w:val="28"/>
+        </w:rPr>
+        <w:tab/>
+      </w:r>
+      <w:r>
+        <w:rPr>
+          <w:rFonts w:ascii="Times New Roman" w:hAnsi="Times New Roman" w:cs="Times New Roman"/>
+          <w:b/>
+          <w:bCs/>
+          <w:sz w:val="28"/>
+          <w:szCs w:val="28"/>
+        </w:rPr>
+        <w:tab/>
+      </w:r>
+      <w:r>
+        <w:rPr>
+          <w:rFonts w:ascii="Times New Roman" w:hAnsi="Times New Roman" w:cs="Times New Roman"/>
+          <w:b/>
+          <w:bCs/>
+          <w:sz w:val="28"/>
+          <w:szCs w:val="28"/>
+        </w:rPr>
+        <w:tab/>
+      </w:r>
+      <w:r>
+        <w:rPr>
+          <w:rFonts w:ascii="Times New Roman" w:hAnsi="Times New Roman" w:cs="Times New Roman"/>
+          <w:b/>
+          <w:bCs/>
+          <w:sz w:val="28"/>
+          <w:szCs w:val="28"/>
+        </w:rPr>
+        <w:tab/>
+      </w:r>
+      <w:r>
+        <w:rPr>
+          <w:rFonts w:ascii="Times New Roman" w:hAnsi="Times New Roman" w:cs="Times New Roman"/>
+          <w:b/>
+          <w:bCs/>
+          <w:sz w:val="28"/>
+          <w:szCs w:val="28"/>
+        </w:rPr>
+        <w:t xml:space="preserve">(4×2=8) </w:t>
+      </w:r>
+    </w:p>
+    <w:p>
+      <w:pPr>
+        <w:rPr>
+          <w:rFonts w:ascii="Times New Roman" w:hAnsi="Times New Roman" w:cs="Times New Roman"/>
+          <w:sz w:val="28"/>
+          <w:szCs w:val="28"/>
+        </w:rPr>
+      </w:pPr>
+      <w:r>
+        <w:rPr>
+          <w:rFonts w:ascii="Times New Roman" w:hAnsi="Times New Roman" w:cs="Times New Roman"/>
+          <w:sz w:val="28"/>
+          <w:szCs w:val="28"/>
         </w:rPr>
         <w:t>a. What sort of services do</w:t>
       </w:r>
       <w:r>
         <w:rPr>
           <w:rFonts w:ascii="Times New Roman" w:hAnsi="Times New Roman" w:cs="Times New Roman"/>
-          <w:szCs w:val="22"/>
+          <w:sz w:val="28"/>
+          <w:szCs w:val="28"/>
         </w:rPr>
         <w:t>es</w:t>
       </w:r>
       <w:r>
         <w:rPr>
           <w:rFonts w:ascii="Times New Roman" w:hAnsi="Times New Roman" w:cs="Times New Roman"/>
-          <w:szCs w:val="22"/>
+          <w:sz w:val="28"/>
+          <w:szCs w:val="28"/>
         </w:rPr>
         <w:t xml:space="preserve"> farmers get from local level government? (Any four)</w:t>
       </w:r>
@@ -1366,101 +2068,83 @@
       <w:pPr>
         <w:rPr>
           <w:rFonts w:ascii="Times New Roman" w:hAnsi="Times New Roman" w:cs="Times New Roman"/>
-          <w:szCs w:val="22"/>
-        </w:rPr>
-      </w:pPr>
-      <w:r>
-        <w:rPr>
-          <w:rFonts w:ascii="Times New Roman" w:hAnsi="Times New Roman" w:cs="Times New Roman"/>
-          <w:szCs w:val="22"/>
-        </w:rPr>
-        <w:t>………………………………………………………………………………………………………</w:t>
-      </w:r>
-      <w:r>
-        <w:rPr>
-          <w:rFonts w:ascii="Times New Roman" w:hAnsi="Times New Roman" w:cs="Times New Roman"/>
-          <w:szCs w:val="22"/>
-        </w:rPr>
-        <w:t>………..</w:t>
-      </w:r>
-    </w:p>
-    <w:p>
-      <w:pPr>
-        <w:rPr>
-          <w:rFonts w:ascii="Times New Roman" w:hAnsi="Times New Roman" w:cs="Times New Roman"/>
-          <w:szCs w:val="22"/>
-        </w:rPr>
-      </w:pPr>
-      <w:r>
-        <w:rPr>
-          <w:rFonts w:ascii="Times New Roman" w:hAnsi="Times New Roman" w:cs="Times New Roman"/>
-          <w:szCs w:val="22"/>
-        </w:rPr>
-        <w:t>………………………………………………………………………………………………………</w:t>
-      </w:r>
-      <w:r>
-        <w:rPr>
-          <w:rFonts w:ascii="Times New Roman" w:hAnsi="Times New Roman" w:cs="Times New Roman"/>
-          <w:szCs w:val="22"/>
-        </w:rPr>
-        <w:t>………..</w:t>
-      </w:r>
-    </w:p>
-    <w:p>
-      <w:pPr>
-        <w:rPr>
-          <w:rFonts w:ascii="Times New Roman" w:hAnsi="Times New Roman" w:cs="Times New Roman"/>
-          <w:szCs w:val="22"/>
-        </w:rPr>
-      </w:pPr>
-      <w:r>
-        <w:rPr>
-          <w:rFonts w:ascii="Times New Roman" w:hAnsi="Times New Roman" w:cs="Times New Roman"/>
-          <w:szCs w:val="22"/>
-        </w:rPr>
-        <w:t>………………………………………………………………………………………………………</w:t>
-      </w:r>
-      <w:r>
-        <w:rPr>
-          <w:rFonts w:ascii="Times New Roman" w:hAnsi="Times New Roman" w:cs="Times New Roman"/>
-          <w:szCs w:val="22"/>
-        </w:rPr>
-        <w:t>………..</w:t>
-      </w:r>
-    </w:p>
-    <w:p>
-      <w:pPr>
-        <w:rPr>
-          <w:rFonts w:ascii="Times New Roman" w:hAnsi="Times New Roman" w:cs="Times New Roman"/>
-          <w:szCs w:val="22"/>
-        </w:rPr>
-      </w:pPr>
-      <w:r>
-        <w:rPr>
-          <w:rFonts w:ascii="Times New Roman" w:hAnsi="Times New Roman" w:cs="Times New Roman"/>
-          <w:szCs w:val="22"/>
-        </w:rPr>
-        <w:t>………………………………………………………………………………………………………</w:t>
-      </w:r>
-      <w:r>
-        <w:rPr>
-          <w:rFonts w:ascii="Times New Roman" w:hAnsi="Times New Roman" w:cs="Times New Roman"/>
-          <w:szCs w:val="22"/>
-        </w:rPr>
-        <w:t>………..</w:t>
-      </w:r>
-    </w:p>
-    <w:p>
-      <w:pPr>
-        <w:rPr>
-          <w:rFonts w:ascii="Times New Roman" w:hAnsi="Times New Roman" w:cs="Times New Roman"/>
-          <w:szCs w:val="22"/>
-        </w:rPr>
-      </w:pPr>
-      <w:r>
-        <w:rPr>
-          <w:rFonts w:ascii="Times New Roman" w:hAnsi="Times New Roman" w:cs="Times New Roman"/>
-          <w:szCs w:val="22"/>
+          <w:sz w:val="28"/>
+          <w:szCs w:val="28"/>
+        </w:rPr>
+      </w:pPr>
+      <w:r>
+        <w:rPr>
+          <w:rFonts w:ascii="Times New Roman" w:hAnsi="Times New Roman" w:cs="Times New Roman"/>
+          <w:sz w:val="28"/>
+          <w:szCs w:val="28"/>
+        </w:rPr>
+        <w:t>…………………………………………………………………………………………………</w:t>
+      </w:r>
+    </w:p>
+    <w:p>
+      <w:pPr>
+        <w:rPr>
+          <w:rFonts w:ascii="Times New Roman" w:hAnsi="Times New Roman" w:cs="Times New Roman"/>
+          <w:sz w:val="28"/>
+          <w:szCs w:val="28"/>
+        </w:rPr>
+      </w:pPr>
+      <w:r>
+        <w:rPr>
+          <w:rFonts w:ascii="Times New Roman" w:hAnsi="Times New Roman" w:cs="Times New Roman"/>
+          <w:sz w:val="28"/>
+          <w:szCs w:val="28"/>
+        </w:rPr>
+        <w:t>…………………………………………………………………………………………………</w:t>
+      </w:r>
+    </w:p>
+    <w:p>
+      <w:pPr>
+        <w:rPr>
+          <w:rFonts w:ascii="Times New Roman" w:hAnsi="Times New Roman" w:cs="Times New Roman"/>
+          <w:sz w:val="28"/>
+          <w:szCs w:val="28"/>
+        </w:rPr>
+      </w:pPr>
+      <w:r>
+        <w:rPr>
+          <w:rFonts w:ascii="Times New Roman" w:hAnsi="Times New Roman" w:cs="Times New Roman"/>
+          <w:sz w:val="28"/>
+          <w:szCs w:val="28"/>
+        </w:rPr>
+        <w:t>…………………………………………………………………………………………………</w:t>
+      </w:r>
+    </w:p>
+    <w:p>
+      <w:pPr>
+        <w:rPr>
+          <w:rFonts w:ascii="Times New Roman" w:hAnsi="Times New Roman" w:cs="Times New Roman"/>
+          <w:sz w:val="28"/>
+          <w:szCs w:val="28"/>
+        </w:rPr>
+      </w:pPr>
+      <w:r>
+        <w:rPr>
+          <w:rFonts w:ascii="Times New Roman" w:hAnsi="Times New Roman" w:cs="Times New Roman"/>
+          <w:sz w:val="28"/>
+          <w:szCs w:val="28"/>
+        </w:rPr>
+        <w:t>…………………………………………………………………………………………………</w:t>
+      </w:r>
+    </w:p>
+    <w:p>
+      <w:pPr>
+        <w:rPr>
+          <w:rFonts w:ascii="Times New Roman" w:hAnsi="Times New Roman" w:cs="Times New Roman"/>
+          <w:sz w:val="28"/>
+          <w:szCs w:val="28"/>
+        </w:rPr>
+      </w:pPr>
+      <w:r>
+        <w:rPr>
+          <w:rFonts w:ascii="Times New Roman" w:hAnsi="Times New Roman" w:cs="Times New Roman"/>
+          <w:sz w:val="28"/>
+          <w:szCs w:val="28"/>
         </w:rPr>
         <w:t>b. Write any four things that creates sound pollution.</w:t>
       </w:r>
@@ -1470,22 +2154,17 @@
         <w:spacing w:line="240" w:lineRule="auto"/>
         <w:rPr>
           <w:rFonts w:ascii="Times New Roman" w:hAnsi="Times New Roman" w:cs="Times New Roman"/>
-          <w:szCs w:val="22"/>
-        </w:rPr>
-      </w:pPr>
-      <w:r>
-        <w:rPr>
-          <w:rFonts w:ascii="Times New Roman" w:hAnsi="Times New Roman" w:cs="Times New Roman"/>
-          <w:szCs w:val="22"/>
-        </w:rPr>
-        <w:t>………………………………………………………………………………………………………</w:t>
-      </w:r>
-      <w:r>
-        <w:rPr>
-          <w:rFonts w:ascii="Times New Roman" w:hAnsi="Times New Roman" w:cs="Times New Roman"/>
-          <w:szCs w:val="22"/>
-        </w:rPr>
-        <w:t>………..</w:t>
+          <w:sz w:val="28"/>
+          <w:szCs w:val="28"/>
+        </w:rPr>
+      </w:pPr>
+      <w:r>
+        <w:rPr>
+          <w:rFonts w:ascii="Times New Roman" w:hAnsi="Times New Roman" w:cs="Times New Roman"/>
+          <w:sz w:val="28"/>
+          <w:szCs w:val="28"/>
+        </w:rPr>
+        <w:t>…………………………………………………………………………………………………</w:t>
       </w:r>
     </w:p>
     <w:p>
@@ -1493,22 +2172,17 @@
         <w:spacing w:line="240" w:lineRule="auto"/>
         <w:rPr>
           <w:rFonts w:ascii="Times New Roman" w:hAnsi="Times New Roman" w:cs="Times New Roman"/>
-          <w:szCs w:val="22"/>
-        </w:rPr>
-      </w:pPr>
-      <w:r>
-        <w:rPr>
-          <w:rFonts w:ascii="Times New Roman" w:hAnsi="Times New Roman" w:cs="Times New Roman"/>
-          <w:szCs w:val="22"/>
-        </w:rPr>
-        <w:t>………………………………………………………………………………………………………</w:t>
-      </w:r>
-      <w:r>
-        <w:rPr>
-          <w:rFonts w:ascii="Times New Roman" w:hAnsi="Times New Roman" w:cs="Times New Roman"/>
-          <w:szCs w:val="22"/>
-        </w:rPr>
-        <w:t>………..</w:t>
+          <w:sz w:val="28"/>
+          <w:szCs w:val="28"/>
+        </w:rPr>
+      </w:pPr>
+      <w:r>
+        <w:rPr>
+          <w:rFonts w:ascii="Times New Roman" w:hAnsi="Times New Roman" w:cs="Times New Roman"/>
+          <w:sz w:val="28"/>
+          <w:szCs w:val="28"/>
+        </w:rPr>
+        <w:t>…………………………………………………………………………………………………</w:t>
       </w:r>
     </w:p>
     <w:p>
@@ -1516,22 +2190,17 @@
         <w:spacing w:line="240" w:lineRule="auto"/>
         <w:rPr>
           <w:rFonts w:ascii="Times New Roman" w:hAnsi="Times New Roman" w:cs="Times New Roman"/>
-          <w:szCs w:val="22"/>
-        </w:rPr>
-      </w:pPr>
-      <w:r>
-        <w:rPr>
-          <w:rFonts w:ascii="Times New Roman" w:hAnsi="Times New Roman" w:cs="Times New Roman"/>
-          <w:szCs w:val="22"/>
-        </w:rPr>
-        <w:t>………………………………………………………………………………………………………</w:t>
-      </w:r>
-      <w:r>
-        <w:rPr>
-          <w:rFonts w:ascii="Times New Roman" w:hAnsi="Times New Roman" w:cs="Times New Roman"/>
-          <w:szCs w:val="22"/>
-        </w:rPr>
-        <w:t>………..</w:t>
+          <w:sz w:val="28"/>
+          <w:szCs w:val="28"/>
+        </w:rPr>
+      </w:pPr>
+      <w:r>
+        <w:rPr>
+          <w:rFonts w:ascii="Times New Roman" w:hAnsi="Times New Roman" w:cs="Times New Roman"/>
+          <w:sz w:val="28"/>
+          <w:szCs w:val="28"/>
+        </w:rPr>
+        <w:t>…………………………………………………………………………………………………</w:t>
       </w:r>
     </w:p>
     <w:p>
@@ -1539,27 +2208,45 @@
         <w:spacing w:line="240" w:lineRule="auto"/>
         <w:rPr>
           <w:rFonts w:ascii="Times New Roman" w:hAnsi="Times New Roman" w:cs="Times New Roman"/>
-          <w:szCs w:val="22"/>
-        </w:rPr>
-      </w:pPr>
-      <w:r>
-        <w:rPr>
-          <w:rFonts w:ascii="Times New Roman" w:hAnsi="Times New Roman" w:cs="Times New Roman"/>
-          <w:szCs w:val="22"/>
-        </w:rPr>
-        <w:t>………………………………………………………………………………………………………</w:t>
-      </w:r>
-      <w:r>
-        <w:rPr>
-          <w:rFonts w:ascii="Times New Roman" w:hAnsi="Times New Roman" w:cs="Times New Roman"/>
-          <w:szCs w:val="22"/>
-        </w:rPr>
-        <w:t>………..</w:t>
+          <w:sz w:val="28"/>
+          <w:szCs w:val="28"/>
+        </w:rPr>
+      </w:pPr>
+      <w:r>
+        <w:rPr>
+          <w:rFonts w:ascii="Times New Roman" w:hAnsi="Times New Roman" w:cs="Times New Roman"/>
+          <w:sz w:val="28"/>
+          <w:szCs w:val="28"/>
+        </w:rPr>
+        <w:t>…………………………………………………………………………………………………</w:t>
+      </w:r>
+    </w:p>
+    <w:p>
+      <w:pPr>
+        <w:spacing w:line="240" w:lineRule="auto"/>
+        <w:jc w:val="center"/>
+        <w:rPr>
+          <w:rFonts w:ascii="Times New Roman" w:hAnsi="Times New Roman" w:cs="Times New Roman"/>
+          <w:b/>
+          <w:bCs/>
+          <w:sz w:val="28"/>
+          <w:szCs w:val="28"/>
+        </w:rPr>
+      </w:pPr>
+      <w:r>
+        <w:rPr>
+          <w:rFonts w:ascii="Times New Roman" w:hAnsi="Times New Roman" w:cs="Times New Roman"/>
+          <w:b/>
+          <w:bCs/>
+          <w:sz w:val="28"/>
+          <w:szCs w:val="28"/>
+        </w:rPr>
+        <w:t>The End</w:t>
       </w:r>
     </w:p>
     <w:sectPr>
-      <w:pgSz w:w="12240" w:h="15840"/>
-      <w:pgMar w:top="1440" w:right="1440" w:bottom="1440" w:left="1440" w:header="708" w:footer="708" w:gutter="0"/>
+      <w:pgSz w:w="11906" w:h="16838" w:code="9"/>
+      <w:pgMar w:top="720" w:right="720" w:bottom="720" w:left="720" w:header="708" w:footer="708" w:gutter="0"/>
       <w:cols w:space="708"/>
       <w:docGrid w:linePitch="360"/>
     </w:sectPr>

</xml_diff>